<commit_message>
added the waveform of zebraz_and2
</commit_message>
<xml_diff>
--- a/03_Documentation/Zebraz_Design_Documentation.docx
+++ b/03_Documentation/Zebraz_Design_Documentation.docx
@@ -1398,6 +1398,7 @@
           <w:rFonts w:ascii="Times New Roman" w:hAnsi="Times New Roman" w:cs="Times New Roman"/>
           <w:b/>
           <w:bCs/>
+          <w:noProof/>
         </w:rPr>
         <w:drawing>
           <wp:inline distT="0" distB="0" distL="0" distR="0" wp14:anchorId="548C7D1D" wp14:editId="52AF1D40">
@@ -1856,6 +1857,9 @@
             </m:e>
           </m:acc>
           <m:r>
+            <m:rPr>
+              <m:sty m:val="p"/>
+            </m:rPr>
             <w:rPr>
               <w:rFonts w:ascii="Times New Roman" w:hAnsi="Times New Roman" w:cs="Times New Roman"/>
             </w:rPr>
@@ -2815,11 +2819,20 @@
           <w:rFonts w:ascii="Times New Roman" w:hAnsi="Times New Roman" w:cs="Times New Roman"/>
           <w:b/>
           <w:bCs/>
+          <w:noProof/>
         </w:rPr>
         <w:drawing>
-          <wp:inline distT="0" distB="0" distL="0" distR="0" wp14:anchorId="00CCB23B" wp14:editId="32969F95">
+          <wp:anchor distT="0" distB="0" distL="114300" distR="114300" simplePos="0" relativeHeight="251658240" behindDoc="0" locked="0" layoutInCell="1" allowOverlap="1" wp14:anchorId="00CCB23B" wp14:editId="343ADC77">
+            <wp:simplePos x="933450" y="3067050"/>
+            <wp:positionH relativeFrom="column">
+              <wp:align>left</wp:align>
+            </wp:positionH>
+            <wp:positionV relativeFrom="paragraph">
+              <wp:align>top</wp:align>
+            </wp:positionV>
             <wp:extent cx="5731510" cy="1869440"/>
             <wp:effectExtent l="19050" t="19050" r="21590" b="16510"/>
+            <wp:wrapSquare wrapText="bothSides"/>
             <wp:docPr id="1124349221" name="Picture 1"/>
             <wp:cNvGraphicFramePr>
               <a:graphicFrameLocks xmlns:a="http://schemas.openxmlformats.org/drawingml/2006/main" noChangeAspect="1"/>
@@ -2832,7 +2845,13 @@
                     <pic:cNvPicPr/>
                   </pic:nvPicPr>
                   <pic:blipFill>
-                    <a:blip r:embed="rId6"/>
+                    <a:blip r:embed="rId6">
+                      <a:extLst>
+                        <a:ext uri="{28A0092B-C50C-407E-A947-70E740481C1C}">
+                          <a14:useLocalDpi xmlns:a14="http://schemas.microsoft.com/office/drawing/2010/main" val="0"/>
+                        </a:ext>
+                      </a:extLst>
+                    </a:blip>
                     <a:stretch>
                       <a:fillRect/>
                     </a:stretch>
@@ -2854,28 +2873,1707 @@
                 </pic:pic>
               </a:graphicData>
             </a:graphic>
+          </wp:anchor>
+        </w:drawing>
+      </w:r>
+      <w:r>
+        <w:rPr>
+          <w:rFonts w:ascii="Times New Roman" w:hAnsi="Times New Roman" w:cs="Times New Roman"/>
+          <w:b/>
+          <w:bCs/>
+        </w:rPr>
+        <w:br w:type="textWrapping" w:clear="all"/>
+      </w:r>
+    </w:p>
+    <w:p>
+      <w:pPr>
+        <w:rPr>
+          <w:rFonts w:ascii="Times New Roman" w:hAnsi="Times New Roman" w:cs="Times New Roman"/>
+        </w:rPr>
+      </w:pPr>
+      <w:r>
+        <w:rPr>
+          <w:rFonts w:ascii="Times New Roman" w:hAnsi="Times New Roman" w:cs="Times New Roman"/>
+        </w:rPr>
+        <w:br w:type="page"/>
+      </w:r>
+    </w:p>
+    <w:p>
+      <w:pPr>
+        <w:pStyle w:val="Heading3"/>
+        <w:rPr>
+          <w:rFonts w:ascii="Times New Roman" w:hAnsi="Times New Roman" w:cs="Times New Roman"/>
+        </w:rPr>
+      </w:pPr>
+      <w:r>
+        <w:rPr>
+          <w:rFonts w:ascii="Times New Roman" w:hAnsi="Times New Roman" w:cs="Times New Roman"/>
+        </w:rPr>
+        <w:lastRenderedPageBreak/>
+        <w:t>3.3 And2:</w:t>
+      </w:r>
+    </w:p>
+    <w:p>
+      <w:pPr>
+        <w:rPr>
+          <w:rFonts w:ascii="Times New Roman" w:hAnsi="Times New Roman" w:cs="Times New Roman"/>
+          <w:b/>
+          <w:bCs/>
+        </w:rPr>
+      </w:pPr>
+      <w:r>
+        <w:rPr>
+          <w:rFonts w:ascii="Times New Roman" w:hAnsi="Times New Roman" w:cs="Times New Roman"/>
+          <w:b/>
+          <w:bCs/>
+        </w:rPr>
+        <w:t>Objective</w:t>
+      </w:r>
+    </w:p>
+    <w:p>
+      <w:pPr>
+        <w:rPr>
+          <w:rFonts w:ascii="Times New Roman" w:hAnsi="Times New Roman" w:cs="Times New Roman"/>
+        </w:rPr>
+      </w:pPr>
+      <w:r>
+        <w:rPr>
+          <w:rFonts w:ascii="Times New Roman" w:hAnsi="Times New Roman" w:cs="Times New Roman"/>
+        </w:rPr>
+        <w:t xml:space="preserve">The objective of this module is to design and implement a </w:t>
+      </w:r>
+      <w:r>
+        <w:rPr>
+          <w:rFonts w:ascii="Times New Roman" w:hAnsi="Times New Roman" w:cs="Times New Roman"/>
+          <w:b/>
+          <w:bCs/>
+        </w:rPr>
+        <w:t>2-input AND gate</w:t>
+      </w:r>
+      <w:r>
+        <w:rPr>
+          <w:rFonts w:ascii="Times New Roman" w:hAnsi="Times New Roman" w:cs="Times New Roman"/>
+        </w:rPr>
+        <w:t xml:space="preserve"> at the Register Transfer Level (RTL) using previously developed </w:t>
+      </w:r>
+      <w:r>
+        <w:rPr>
+          <w:rFonts w:ascii="Times New Roman" w:hAnsi="Times New Roman" w:cs="Times New Roman"/>
+          <w:b/>
+          <w:bCs/>
+        </w:rPr>
+        <w:t>2-input NAND</w:t>
+      </w:r>
+      <w:r>
+        <w:rPr>
+          <w:rFonts w:ascii="Times New Roman" w:hAnsi="Times New Roman" w:cs="Times New Roman"/>
+        </w:rPr>
+        <w:t xml:space="preserve"> and </w:t>
+      </w:r>
+      <w:r>
+        <w:rPr>
+          <w:rFonts w:ascii="Times New Roman" w:hAnsi="Times New Roman" w:cs="Times New Roman"/>
+          <w:b/>
+          <w:bCs/>
+        </w:rPr>
+        <w:t>Inverter</w:t>
+      </w:r>
+      <w:r>
+        <w:rPr>
+          <w:rFonts w:ascii="Times New Roman" w:hAnsi="Times New Roman" w:cs="Times New Roman"/>
+        </w:rPr>
+        <w:t xml:space="preserve"> modules. The design demonstrates the concept of hierarchical and modular digital design by constructing a more complex logic function from reusable lower-level modules. The functionality of the AND gate is verified through simulation using a dedicated testbench, ensuring correct operation for all possible input combinations before integrating the module into the proposed 2-bit microprocessor.</w:t>
+      </w:r>
+    </w:p>
+    <w:p>
+      <w:pPr>
+        <w:rPr>
+          <w:rFonts w:ascii="Times New Roman" w:hAnsi="Times New Roman" w:cs="Times New Roman"/>
+          <w:b/>
+          <w:bCs/>
+        </w:rPr>
+      </w:pPr>
+      <w:r>
+        <w:rPr>
+          <w:rFonts w:ascii="Times New Roman" w:hAnsi="Times New Roman" w:cs="Times New Roman"/>
+          <w:b/>
+          <w:bCs/>
+        </w:rPr>
+        <w:t>Theory</w:t>
+      </w:r>
+    </w:p>
+    <w:p>
+      <w:pPr>
+        <w:rPr>
+          <w:rFonts w:ascii="Times New Roman" w:hAnsi="Times New Roman" w:cs="Times New Roman"/>
+        </w:rPr>
+      </w:pPr>
+      <w:r>
+        <w:rPr>
+          <w:rFonts w:ascii="Times New Roman" w:hAnsi="Times New Roman" w:cs="Times New Roman"/>
+        </w:rPr>
+        <w:t>A two-input AND gate is a fundamental combinational logic circuit that performs the logical AND operation on two binary inputs. The output is logic '1' only when both input signals are logic '1'; otherwise, the output remains logic '0'. AND gates are widely used in digital systems for implementing conditional logic, enabling signals, arithmetic operations, and control functions.</w:t>
+      </w:r>
+    </w:p>
+    <w:p>
+      <w:pPr>
+        <w:rPr>
+          <w:rFonts w:ascii="Times New Roman" w:hAnsi="Times New Roman" w:cs="Times New Roman"/>
+        </w:rPr>
+      </w:pPr>
+      <w:r>
+        <w:rPr>
+          <w:rFonts w:ascii="Times New Roman" w:hAnsi="Times New Roman" w:cs="Times New Roman"/>
+        </w:rPr>
+        <w:t xml:space="preserve">Instead of implementing the AND operation directly, this module adopts a </w:t>
+      </w:r>
+      <w:r>
+        <w:rPr>
+          <w:rFonts w:ascii="Times New Roman" w:hAnsi="Times New Roman" w:cs="Times New Roman"/>
+          <w:b/>
+          <w:bCs/>
+        </w:rPr>
+        <w:t>hierarchical RTL design approach</w:t>
+      </w:r>
+      <w:r>
+        <w:rPr>
+          <w:rFonts w:ascii="Times New Roman" w:hAnsi="Times New Roman" w:cs="Times New Roman"/>
+        </w:rPr>
+        <w:t xml:space="preserve"> by utilizing the previously designed </w:t>
+      </w:r>
+      <w:r>
+        <w:rPr>
+          <w:rFonts w:ascii="Times New Roman" w:hAnsi="Times New Roman" w:cs="Times New Roman"/>
+          <w:b/>
+          <w:bCs/>
+        </w:rPr>
+        <w:t>2-input NAND gate</w:t>
+      </w:r>
+      <w:r>
+        <w:rPr>
+          <w:rFonts w:ascii="Times New Roman" w:hAnsi="Times New Roman" w:cs="Times New Roman"/>
+        </w:rPr>
+        <w:t xml:space="preserve"> and </w:t>
+      </w:r>
+      <w:r>
+        <w:rPr>
+          <w:rFonts w:ascii="Times New Roman" w:hAnsi="Times New Roman" w:cs="Times New Roman"/>
+          <w:b/>
+          <w:bCs/>
+        </w:rPr>
+        <w:t>Inverter</w:t>
+      </w:r>
+      <w:r>
+        <w:rPr>
+          <w:rFonts w:ascii="Times New Roman" w:hAnsi="Times New Roman" w:cs="Times New Roman"/>
+        </w:rPr>
+        <w:t xml:space="preserve"> modules. This implementation is based on the Boolean identity that an AND function can be obtained by inverting the output of a NAND gate. By connecting the output of the NAND gate to an inverter, the complemented NAND output is converted back into the required AND output.</w:t>
+      </w:r>
+    </w:p>
+    <w:p>
+      <w:pPr>
+        <w:rPr>
+          <w:rFonts w:ascii="Times New Roman" w:hAnsi="Times New Roman" w:cs="Times New Roman"/>
+        </w:rPr>
+      </w:pPr>
+      <w:r>
+        <w:rPr>
+          <w:rFonts w:ascii="Times New Roman" w:hAnsi="Times New Roman" w:cs="Times New Roman"/>
+        </w:rPr>
+        <w:t xml:space="preserve">This design methodology promotes </w:t>
+      </w:r>
+      <w:r>
+        <w:rPr>
+          <w:rFonts w:ascii="Times New Roman" w:hAnsi="Times New Roman" w:cs="Times New Roman"/>
+          <w:b/>
+          <w:bCs/>
+        </w:rPr>
+        <w:t>module reusability</w:t>
+      </w:r>
+      <w:r>
+        <w:rPr>
+          <w:rFonts w:ascii="Times New Roman" w:hAnsi="Times New Roman" w:cs="Times New Roman"/>
+        </w:rPr>
+        <w:t>, one of the key principles of RTL design. Once a module has been verified independently, it can be instantiated multiple times within larger designs without rewriting its functionality. Such an approach improves code readability, simplifies debugging, reduces development time, and enables scalable digital system design.</w:t>
+      </w:r>
+    </w:p>
+    <w:p>
+      <w:pPr>
+        <w:rPr>
+          <w:rFonts w:ascii="Times New Roman" w:hAnsi="Times New Roman" w:cs="Times New Roman"/>
+        </w:rPr>
+      </w:pPr>
+      <w:r>
+        <w:rPr>
+          <w:rFonts w:ascii="Times New Roman" w:hAnsi="Times New Roman" w:cs="Times New Roman"/>
+        </w:rPr>
+        <w:t>In the proposed 2-bit microprocessor, the AND gate forms an important component for implementing logical operations and control functions. Building the AND gate from previously verified modules also demonstrates the hierarchical nature of hardware description languages, where complex digital systems are constructed by interconnecting simpler functional blocks.</w:t>
+      </w:r>
+    </w:p>
+    <w:p>
+      <w:pPr>
+        <w:rPr>
+          <w:rFonts w:ascii="Times New Roman" w:hAnsi="Times New Roman" w:cs="Times New Roman"/>
+          <w:b/>
+          <w:bCs/>
+        </w:rPr>
+      </w:pPr>
+      <w:r>
+        <w:rPr>
+          <w:rFonts w:ascii="Times New Roman" w:hAnsi="Times New Roman" w:cs="Times New Roman"/>
+          <w:b/>
+          <w:bCs/>
+        </w:rPr>
+        <w:t>Functional Description</w:t>
+      </w:r>
+    </w:p>
+    <w:p>
+      <w:pPr>
+        <w:rPr>
+          <w:rFonts w:ascii="Times New Roman" w:hAnsi="Times New Roman" w:cs="Times New Roman"/>
+        </w:rPr>
+      </w:pPr>
+      <w:r>
+        <w:rPr>
+          <w:rFonts w:ascii="Times New Roman" w:hAnsi="Times New Roman" w:cs="Times New Roman"/>
+        </w:rPr>
+        <w:t xml:space="preserve">The module accepts two binary inputs, </w:t>
+      </w:r>
+      <w:r>
+        <w:rPr>
+          <w:rFonts w:ascii="Times New Roman" w:hAnsi="Times New Roman" w:cs="Times New Roman"/>
+          <w:b/>
+          <w:bCs/>
+        </w:rPr>
+        <w:t>A</w:t>
+      </w:r>
+      <w:r>
+        <w:rPr>
+          <w:rFonts w:ascii="Times New Roman" w:hAnsi="Times New Roman" w:cs="Times New Roman"/>
+        </w:rPr>
+        <w:t xml:space="preserve"> and </w:t>
+      </w:r>
+      <w:r>
+        <w:rPr>
+          <w:rFonts w:ascii="Times New Roman" w:hAnsi="Times New Roman" w:cs="Times New Roman"/>
+          <w:b/>
+          <w:bCs/>
+        </w:rPr>
+        <w:t>B</w:t>
+      </w:r>
+      <w:r>
+        <w:rPr>
+          <w:rFonts w:ascii="Times New Roman" w:hAnsi="Times New Roman" w:cs="Times New Roman"/>
+        </w:rPr>
+        <w:t xml:space="preserve">, and produces a single binary output, </w:t>
+      </w:r>
+      <w:r>
+        <w:rPr>
+          <w:rFonts w:ascii="Times New Roman" w:hAnsi="Times New Roman" w:cs="Times New Roman"/>
+          <w:b/>
+          <w:bCs/>
+        </w:rPr>
+        <w:t>Y</w:t>
+      </w:r>
+      <w:r>
+        <w:rPr>
+          <w:rFonts w:ascii="Times New Roman" w:hAnsi="Times New Roman" w:cs="Times New Roman"/>
+        </w:rPr>
+        <w:t xml:space="preserve">. The inputs are first applied to the previously designed </w:t>
+      </w:r>
+      <w:r>
+        <w:rPr>
+          <w:rFonts w:ascii="Times New Roman" w:hAnsi="Times New Roman" w:cs="Times New Roman"/>
+          <w:b/>
+          <w:bCs/>
+        </w:rPr>
+        <w:t>2-input NAND gate</w:t>
+      </w:r>
+      <w:r>
+        <w:rPr>
+          <w:rFonts w:ascii="Times New Roman" w:hAnsi="Times New Roman" w:cs="Times New Roman"/>
+        </w:rPr>
+        <w:t>, producing the intermediate signal:</w:t>
+      </w:r>
+    </w:p>
+    <w:p>
+      <w:pPr>
+        <w:rPr>
+          <w:rFonts w:ascii="Times New Roman" w:hAnsi="Times New Roman" w:cs="Times New Roman"/>
+        </w:rPr>
+      </w:pPr>
+      <m:oMathPara>
+        <m:oMath>
+          <m:r>
+            <w:rPr>
+              <w:rFonts w:ascii="Cambria Math" w:hAnsi="Cambria Math" w:cs="Times New Roman"/>
+            </w:rPr>
+            <m:t>N=</m:t>
+          </m:r>
+          <m:groupChr>
+            <m:groupChrPr>
+              <m:chr m:val="‾"/>
+              <m:pos m:val="top"/>
+              <m:vertJc m:val="bot"/>
+              <m:ctrlPr>
+                <w:rPr>
+                  <w:rFonts w:ascii="Cambria Math" w:hAnsi="Cambria Math" w:cs="Times New Roman"/>
+                </w:rPr>
+              </m:ctrlPr>
+            </m:groupChrPr>
+            <m:e>
+              <m:r>
+                <w:rPr>
+                  <w:rFonts w:ascii="Cambria Math" w:hAnsi="Cambria Math" w:cs="Times New Roman"/>
+                </w:rPr>
+                <m:t>A⋅B</m:t>
+              </m:r>
+            </m:e>
+          </m:groupChr>
+          <m:r>
+            <w:rPr>
+              <w:rFonts w:ascii="Times New Roman" w:hAnsi="Times New Roman" w:cs="Times New Roman"/>
+            </w:rPr>
+            <w:br/>
+          </m:r>
+        </m:oMath>
+      </m:oMathPara>
+    </w:p>
+    <w:p>
+      <w:pPr>
+        <w:rPr>
+          <w:rFonts w:ascii="Times New Roman" w:hAnsi="Times New Roman" w:cs="Times New Roman"/>
+        </w:rPr>
+      </w:pPr>
+      <w:r>
+        <w:rPr>
+          <w:rFonts w:ascii="Times New Roman" w:hAnsi="Times New Roman" w:cs="Times New Roman"/>
+        </w:rPr>
+        <w:lastRenderedPageBreak/>
+        <w:t xml:space="preserve">This intermediate output is then connected to the previously designed </w:t>
+      </w:r>
+      <w:r>
+        <w:rPr>
+          <w:rFonts w:ascii="Times New Roman" w:hAnsi="Times New Roman" w:cs="Times New Roman"/>
+          <w:b/>
+          <w:bCs/>
+        </w:rPr>
+        <w:t>Inverter</w:t>
+      </w:r>
+      <w:r>
+        <w:rPr>
+          <w:rFonts w:ascii="Times New Roman" w:hAnsi="Times New Roman" w:cs="Times New Roman"/>
+        </w:rPr>
+        <w:t xml:space="preserve"> module, which complements the signal to produce the final AND output:</w:t>
+      </w:r>
+    </w:p>
+    <w:p>
+      <w:pPr>
+        <w:rPr>
+          <w:rFonts w:ascii="Times New Roman" w:hAnsi="Times New Roman" w:cs="Times New Roman"/>
+        </w:rPr>
+      </w:pPr>
+      <m:oMathPara>
+        <m:oMath>
+          <m:r>
+            <w:rPr>
+              <w:rFonts w:ascii="Cambria Math" w:hAnsi="Cambria Math" w:cs="Times New Roman"/>
+            </w:rPr>
+            <m:t>Y=</m:t>
+          </m:r>
+          <m:groupChr>
+            <m:groupChrPr>
+              <m:chr m:val="‾"/>
+              <m:pos m:val="top"/>
+              <m:vertJc m:val="bot"/>
+              <m:ctrlPr>
+                <w:rPr>
+                  <w:rFonts w:ascii="Cambria Math" w:hAnsi="Cambria Math" w:cs="Times New Roman"/>
+                </w:rPr>
+              </m:ctrlPr>
+            </m:groupChrPr>
+            <m:e>
+              <m:r>
+                <w:rPr>
+                  <w:rFonts w:ascii="Cambria Math" w:hAnsi="Cambria Math" w:cs="Times New Roman"/>
+                </w:rPr>
+                <m:t>N</m:t>
+              </m:r>
+            </m:e>
+          </m:groupChr>
+          <m:r>
+            <w:rPr>
+              <w:rFonts w:ascii="Cambria Math" w:hAnsi="Cambria Math" w:cs="Times New Roman"/>
+            </w:rPr>
+            <m:t>=A⋅B</m:t>
+          </m:r>
+          <m:r>
+            <w:rPr>
+              <w:rFonts w:ascii="Times New Roman" w:hAnsi="Times New Roman" w:cs="Times New Roman"/>
+              <w:i/>
+            </w:rPr>
+            <w:br/>
+          </m:r>
+        </m:oMath>
+      </m:oMathPara>
+    </w:p>
+    <w:p>
+      <w:pPr>
+        <w:numPr>
+          <w:ilvl w:val="0"/>
+          <w:numId w:val="7"/>
+        </w:numPr>
+        <w:rPr>
+          <w:rFonts w:ascii="Times New Roman" w:hAnsi="Times New Roman" w:cs="Times New Roman"/>
+        </w:rPr>
+      </w:pPr>
+      <w:r>
+        <w:rPr>
+          <w:rFonts w:ascii="Times New Roman" w:hAnsi="Times New Roman" w:cs="Times New Roman"/>
+          <w:b/>
+          <w:bCs/>
+        </w:rPr>
+        <w:t>Inputs:</w:t>
+      </w:r>
+      <w:r>
+        <w:rPr>
+          <w:rFonts w:ascii="Times New Roman" w:hAnsi="Times New Roman" w:cs="Times New Roman"/>
+        </w:rPr>
+        <w:t xml:space="preserve"> A, B </w:t>
+      </w:r>
+    </w:p>
+    <w:p>
+      <w:pPr>
+        <w:numPr>
+          <w:ilvl w:val="0"/>
+          <w:numId w:val="7"/>
+        </w:numPr>
+        <w:rPr>
+          <w:rFonts w:ascii="Times New Roman" w:hAnsi="Times New Roman" w:cs="Times New Roman"/>
+        </w:rPr>
+      </w:pPr>
+      <w:r>
+        <w:rPr>
+          <w:rFonts w:ascii="Times New Roman" w:hAnsi="Times New Roman" w:cs="Times New Roman"/>
+          <w:b/>
+          <w:bCs/>
+        </w:rPr>
+        <w:t>Output:</w:t>
+      </w:r>
+      <w:r>
+        <w:rPr>
+          <w:rFonts w:ascii="Times New Roman" w:hAnsi="Times New Roman" w:cs="Times New Roman"/>
+        </w:rPr>
+        <w:t xml:space="preserve"> Y </w:t>
+      </w:r>
+    </w:p>
+    <w:p>
+      <w:pPr>
+        <w:numPr>
+          <w:ilvl w:val="0"/>
+          <w:numId w:val="7"/>
+        </w:numPr>
+        <w:rPr>
+          <w:rFonts w:ascii="Times New Roman" w:hAnsi="Times New Roman" w:cs="Times New Roman"/>
+        </w:rPr>
+      </w:pPr>
+      <w:r>
+        <w:rPr>
+          <w:rFonts w:ascii="Times New Roman" w:hAnsi="Times New Roman" w:cs="Times New Roman"/>
+          <w:b/>
+          <w:bCs/>
+        </w:rPr>
+        <w:t>Intermediate Signal:</w:t>
+      </w:r>
+      <w:r>
+        <w:rPr>
+          <w:rFonts w:ascii="Times New Roman" w:hAnsi="Times New Roman" w:cs="Times New Roman"/>
+        </w:rPr>
+        <w:t xml:space="preserve"> NAND Output </w:t>
+      </w:r>
+    </w:p>
+    <w:p>
+      <w:pPr>
+        <w:numPr>
+          <w:ilvl w:val="0"/>
+          <w:numId w:val="7"/>
+        </w:numPr>
+        <w:rPr>
+          <w:rFonts w:ascii="Times New Roman" w:hAnsi="Times New Roman" w:cs="Times New Roman"/>
+        </w:rPr>
+      </w:pPr>
+      <w:r>
+        <w:rPr>
+          <w:rFonts w:ascii="Times New Roman" w:hAnsi="Times New Roman" w:cs="Times New Roman"/>
+          <w:b/>
+          <w:bCs/>
+        </w:rPr>
+        <w:t>Type of Logic:</w:t>
+      </w:r>
+      <w:r>
+        <w:rPr>
+          <w:rFonts w:ascii="Times New Roman" w:hAnsi="Times New Roman" w:cs="Times New Roman"/>
+        </w:rPr>
+        <w:t xml:space="preserve"> Combinational</w:t>
+      </w:r>
+    </w:p>
+    <w:p>
+      <w:pPr>
+        <w:rPr>
+          <w:rFonts w:ascii="Times New Roman" w:hAnsi="Times New Roman" w:cs="Times New Roman"/>
+        </w:rPr>
+      </w:pPr>
+    </w:p>
+    <w:p>
+      <w:pPr>
+        <w:rPr>
+          <w:rFonts w:ascii="Times New Roman" w:hAnsi="Times New Roman" w:cs="Times New Roman"/>
+          <w:b/>
+          <w:bCs/>
+        </w:rPr>
+      </w:pPr>
+      <w:r>
+        <w:rPr>
+          <w:rFonts w:ascii="Times New Roman" w:hAnsi="Times New Roman" w:cs="Times New Roman"/>
+          <w:b/>
+          <w:bCs/>
+        </w:rPr>
+        <w:t>Logic Equation</w:t>
+      </w:r>
+    </w:p>
+    <w:p>
+      <w:pPr>
+        <w:rPr>
+          <w:rFonts w:ascii="Times New Roman" w:hAnsi="Times New Roman" w:cs="Times New Roman"/>
+          <w:b/>
+          <w:bCs/>
+        </w:rPr>
+      </w:pPr>
+      <m:oMathPara>
+        <m:oMath>
+          <m:r>
+            <w:rPr>
+              <w:rFonts w:ascii="Cambria Math" w:hAnsi="Cambria Math" w:cs="Times New Roman"/>
+            </w:rPr>
+            <m:t>Y=</m:t>
+          </m:r>
+          <m:groupChr>
+            <m:groupChrPr>
+              <m:chr m:val="‾"/>
+              <m:pos m:val="top"/>
+              <m:vertJc m:val="bot"/>
+              <m:ctrlPr>
+                <w:rPr>
+                  <w:rFonts w:ascii="Cambria Math" w:hAnsi="Cambria Math" w:cs="Times New Roman"/>
+                </w:rPr>
+              </m:ctrlPr>
+            </m:groupChrPr>
+            <m:e>
+              <m:groupChr>
+                <m:groupChrPr>
+                  <m:chr m:val="‾"/>
+                  <m:pos m:val="top"/>
+                  <m:vertJc m:val="bot"/>
+                  <m:ctrlPr>
+                    <w:rPr>
+                      <w:rFonts w:ascii="Cambria Math" w:hAnsi="Cambria Math" w:cs="Times New Roman"/>
+                    </w:rPr>
+                  </m:ctrlPr>
+                </m:groupChrPr>
+                <m:e>
+                  <m:r>
+                    <w:rPr>
+                      <w:rFonts w:ascii="Cambria Math" w:hAnsi="Cambria Math" w:cs="Times New Roman"/>
+                    </w:rPr>
+                    <m:t>A⋅B</m:t>
+                  </m:r>
+                </m:e>
+              </m:groupChr>
+            </m:e>
+          </m:groupChr>
+          <m:r>
+            <w:rPr>
+              <w:rFonts w:ascii="Cambria Math" w:hAnsi="Cambria Math" w:cs="Times New Roman"/>
+            </w:rPr>
+            <m:t>=A⋅B</m:t>
+          </m:r>
+          <m:r>
+            <w:rPr>
+              <w:rFonts w:ascii="Times New Roman" w:hAnsi="Times New Roman" w:cs="Times New Roman"/>
+              <w:i/>
+            </w:rPr>
+            <w:br/>
+          </m:r>
+        </m:oMath>
+      </m:oMathPara>
+      <w:r>
+        <w:rPr>
+          <w:rFonts w:ascii="Times New Roman" w:hAnsi="Times New Roman" w:cs="Times New Roman"/>
+          <w:b/>
+          <w:bCs/>
+        </w:rPr>
+        <w:t>Truth Table</w:t>
+      </w:r>
+    </w:p>
+    <w:tbl>
+      <w:tblPr>
+        <w:tblW w:w="9498" w:type="dxa"/>
+        <w:tblCellSpacing w:w="15" w:type="dxa"/>
+        <w:tblBorders>
+          <w:top w:val="single" w:sz="4" w:space="0" w:color="auto"/>
+          <w:left w:val="single" w:sz="4" w:space="0" w:color="auto"/>
+          <w:bottom w:val="single" w:sz="4" w:space="0" w:color="auto"/>
+          <w:right w:val="single" w:sz="4" w:space="0" w:color="auto"/>
+          <w:insideH w:val="single" w:sz="4" w:space="0" w:color="auto"/>
+          <w:insideV w:val="single" w:sz="4" w:space="0" w:color="auto"/>
+        </w:tblBorders>
+        <w:tblCellMar>
+          <w:top w:w="15" w:type="dxa"/>
+          <w:left w:w="15" w:type="dxa"/>
+          <w:bottom w:w="15" w:type="dxa"/>
+          <w:right w:w="15" w:type="dxa"/>
+        </w:tblCellMar>
+        <w:tblLook w:val="04A0" w:firstRow="1" w:lastRow="0" w:firstColumn="1" w:lastColumn="0" w:noHBand="0" w:noVBand="1"/>
+      </w:tblPr>
+      <w:tblGrid>
+        <w:gridCol w:w="3232"/>
+        <w:gridCol w:w="3033"/>
+        <w:gridCol w:w="3233"/>
+      </w:tblGrid>
+      <w:tr>
+        <w:trPr>
+          <w:trHeight w:val="482"/>
+          <w:tblHeader/>
+          <w:tblCellSpacing w:w="15" w:type="dxa"/>
+        </w:trPr>
+        <w:tc>
+          <w:tcPr>
+            <w:tcW w:w="0" w:type="auto"/>
+            <w:vAlign w:val="center"/>
+            <w:hideMark/>
+          </w:tcPr>
+          <w:p>
+            <w:pPr>
+              <w:jc w:val="center"/>
+              <w:rPr>
+                <w:rFonts w:ascii="Times New Roman" w:hAnsi="Times New Roman" w:cs="Times New Roman"/>
+                <w:b/>
+                <w:bCs/>
+              </w:rPr>
+            </w:pPr>
+            <w:r>
+              <w:rPr>
+                <w:rFonts w:ascii="Times New Roman" w:hAnsi="Times New Roman" w:cs="Times New Roman"/>
+                <w:b/>
+                <w:bCs/>
+              </w:rPr>
+              <w:t>A</w:t>
+            </w:r>
+          </w:p>
+        </w:tc>
+        <w:tc>
+          <w:tcPr>
+            <w:tcW w:w="0" w:type="auto"/>
+            <w:vAlign w:val="center"/>
+            <w:hideMark/>
+          </w:tcPr>
+          <w:p>
+            <w:pPr>
+              <w:jc w:val="center"/>
+              <w:rPr>
+                <w:rFonts w:ascii="Times New Roman" w:hAnsi="Times New Roman" w:cs="Times New Roman"/>
+                <w:b/>
+                <w:bCs/>
+              </w:rPr>
+            </w:pPr>
+            <w:r>
+              <w:rPr>
+                <w:rFonts w:ascii="Times New Roman" w:hAnsi="Times New Roman" w:cs="Times New Roman"/>
+                <w:b/>
+                <w:bCs/>
+              </w:rPr>
+              <w:t>B</w:t>
+            </w:r>
+          </w:p>
+        </w:tc>
+        <w:tc>
+          <w:tcPr>
+            <w:tcW w:w="0" w:type="auto"/>
+            <w:vAlign w:val="center"/>
+            <w:hideMark/>
+          </w:tcPr>
+          <w:p>
+            <w:pPr>
+              <w:jc w:val="center"/>
+              <w:rPr>
+                <w:rFonts w:ascii="Times New Roman" w:hAnsi="Times New Roman" w:cs="Times New Roman"/>
+                <w:b/>
+                <w:bCs/>
+              </w:rPr>
+            </w:pPr>
+            <w:r>
+              <w:rPr>
+                <w:rFonts w:ascii="Times New Roman" w:hAnsi="Times New Roman" w:cs="Times New Roman"/>
+                <w:b/>
+                <w:bCs/>
+              </w:rPr>
+              <w:t>Y</w:t>
+            </w:r>
+          </w:p>
+        </w:tc>
+      </w:tr>
+      <w:tr>
+        <w:trPr>
+          <w:trHeight w:val="467"/>
+          <w:tblCellSpacing w:w="15" w:type="dxa"/>
+        </w:trPr>
+        <w:tc>
+          <w:tcPr>
+            <w:tcW w:w="0" w:type="auto"/>
+            <w:vAlign w:val="center"/>
+            <w:hideMark/>
+          </w:tcPr>
+          <w:p>
+            <w:pPr>
+              <w:jc w:val="center"/>
+              <w:rPr>
+                <w:rFonts w:ascii="Times New Roman" w:hAnsi="Times New Roman" w:cs="Times New Roman"/>
+              </w:rPr>
+            </w:pPr>
+            <w:r>
+              <w:rPr>
+                <w:rFonts w:ascii="Times New Roman" w:hAnsi="Times New Roman" w:cs="Times New Roman"/>
+              </w:rPr>
+              <w:t>0</w:t>
+            </w:r>
+          </w:p>
+        </w:tc>
+        <w:tc>
+          <w:tcPr>
+            <w:tcW w:w="0" w:type="auto"/>
+            <w:vAlign w:val="center"/>
+            <w:hideMark/>
+          </w:tcPr>
+          <w:p>
+            <w:pPr>
+              <w:jc w:val="center"/>
+              <w:rPr>
+                <w:rFonts w:ascii="Times New Roman" w:hAnsi="Times New Roman" w:cs="Times New Roman"/>
+              </w:rPr>
+            </w:pPr>
+            <w:r>
+              <w:rPr>
+                <w:rFonts w:ascii="Times New Roman" w:hAnsi="Times New Roman" w:cs="Times New Roman"/>
+              </w:rPr>
+              <w:t>0</w:t>
+            </w:r>
+          </w:p>
+        </w:tc>
+        <w:tc>
+          <w:tcPr>
+            <w:tcW w:w="0" w:type="auto"/>
+            <w:vAlign w:val="center"/>
+            <w:hideMark/>
+          </w:tcPr>
+          <w:p>
+            <w:pPr>
+              <w:jc w:val="center"/>
+              <w:rPr>
+                <w:rFonts w:ascii="Times New Roman" w:hAnsi="Times New Roman" w:cs="Times New Roman"/>
+              </w:rPr>
+            </w:pPr>
+            <w:r>
+              <w:rPr>
+                <w:rFonts w:ascii="Times New Roman" w:hAnsi="Times New Roman" w:cs="Times New Roman"/>
+              </w:rPr>
+              <w:t>0</w:t>
+            </w:r>
+          </w:p>
+        </w:tc>
+      </w:tr>
+      <w:tr>
+        <w:trPr>
+          <w:trHeight w:val="482"/>
+          <w:tblCellSpacing w:w="15" w:type="dxa"/>
+        </w:trPr>
+        <w:tc>
+          <w:tcPr>
+            <w:tcW w:w="0" w:type="auto"/>
+            <w:vAlign w:val="center"/>
+            <w:hideMark/>
+          </w:tcPr>
+          <w:p>
+            <w:pPr>
+              <w:jc w:val="center"/>
+              <w:rPr>
+                <w:rFonts w:ascii="Times New Roman" w:hAnsi="Times New Roman" w:cs="Times New Roman"/>
+              </w:rPr>
+            </w:pPr>
+            <w:r>
+              <w:rPr>
+                <w:rFonts w:ascii="Times New Roman" w:hAnsi="Times New Roman" w:cs="Times New Roman"/>
+              </w:rPr>
+              <w:t>0</w:t>
+            </w:r>
+          </w:p>
+        </w:tc>
+        <w:tc>
+          <w:tcPr>
+            <w:tcW w:w="0" w:type="auto"/>
+            <w:vAlign w:val="center"/>
+            <w:hideMark/>
+          </w:tcPr>
+          <w:p>
+            <w:pPr>
+              <w:jc w:val="center"/>
+              <w:rPr>
+                <w:rFonts w:ascii="Times New Roman" w:hAnsi="Times New Roman" w:cs="Times New Roman"/>
+              </w:rPr>
+            </w:pPr>
+            <w:r>
+              <w:rPr>
+                <w:rFonts w:ascii="Times New Roman" w:hAnsi="Times New Roman" w:cs="Times New Roman"/>
+              </w:rPr>
+              <w:t>1</w:t>
+            </w:r>
+          </w:p>
+        </w:tc>
+        <w:tc>
+          <w:tcPr>
+            <w:tcW w:w="0" w:type="auto"/>
+            <w:vAlign w:val="center"/>
+            <w:hideMark/>
+          </w:tcPr>
+          <w:p>
+            <w:pPr>
+              <w:jc w:val="center"/>
+              <w:rPr>
+                <w:rFonts w:ascii="Times New Roman" w:hAnsi="Times New Roman" w:cs="Times New Roman"/>
+              </w:rPr>
+            </w:pPr>
+            <w:r>
+              <w:rPr>
+                <w:rFonts w:ascii="Times New Roman" w:hAnsi="Times New Roman" w:cs="Times New Roman"/>
+              </w:rPr>
+              <w:t>0</w:t>
+            </w:r>
+          </w:p>
+        </w:tc>
+      </w:tr>
+      <w:tr>
+        <w:trPr>
+          <w:trHeight w:val="467"/>
+          <w:tblCellSpacing w:w="15" w:type="dxa"/>
+        </w:trPr>
+        <w:tc>
+          <w:tcPr>
+            <w:tcW w:w="0" w:type="auto"/>
+            <w:vAlign w:val="center"/>
+            <w:hideMark/>
+          </w:tcPr>
+          <w:p>
+            <w:pPr>
+              <w:jc w:val="center"/>
+              <w:rPr>
+                <w:rFonts w:ascii="Times New Roman" w:hAnsi="Times New Roman" w:cs="Times New Roman"/>
+              </w:rPr>
+            </w:pPr>
+            <w:r>
+              <w:rPr>
+                <w:rFonts w:ascii="Times New Roman" w:hAnsi="Times New Roman" w:cs="Times New Roman"/>
+              </w:rPr>
+              <w:t>1</w:t>
+            </w:r>
+          </w:p>
+        </w:tc>
+        <w:tc>
+          <w:tcPr>
+            <w:tcW w:w="0" w:type="auto"/>
+            <w:vAlign w:val="center"/>
+            <w:hideMark/>
+          </w:tcPr>
+          <w:p>
+            <w:pPr>
+              <w:jc w:val="center"/>
+              <w:rPr>
+                <w:rFonts w:ascii="Times New Roman" w:hAnsi="Times New Roman" w:cs="Times New Roman"/>
+              </w:rPr>
+            </w:pPr>
+            <w:r>
+              <w:rPr>
+                <w:rFonts w:ascii="Times New Roman" w:hAnsi="Times New Roman" w:cs="Times New Roman"/>
+              </w:rPr>
+              <w:t>0</w:t>
+            </w:r>
+          </w:p>
+        </w:tc>
+        <w:tc>
+          <w:tcPr>
+            <w:tcW w:w="0" w:type="auto"/>
+            <w:vAlign w:val="center"/>
+            <w:hideMark/>
+          </w:tcPr>
+          <w:p>
+            <w:pPr>
+              <w:jc w:val="center"/>
+              <w:rPr>
+                <w:rFonts w:ascii="Times New Roman" w:hAnsi="Times New Roman" w:cs="Times New Roman"/>
+              </w:rPr>
+            </w:pPr>
+            <w:r>
+              <w:rPr>
+                <w:rFonts w:ascii="Times New Roman" w:hAnsi="Times New Roman" w:cs="Times New Roman"/>
+              </w:rPr>
+              <w:t>0</w:t>
+            </w:r>
+          </w:p>
+        </w:tc>
+      </w:tr>
+      <w:tr>
+        <w:trPr>
+          <w:trHeight w:val="482"/>
+          <w:tblCellSpacing w:w="15" w:type="dxa"/>
+        </w:trPr>
+        <w:tc>
+          <w:tcPr>
+            <w:tcW w:w="0" w:type="auto"/>
+            <w:vAlign w:val="center"/>
+            <w:hideMark/>
+          </w:tcPr>
+          <w:p>
+            <w:pPr>
+              <w:jc w:val="center"/>
+              <w:rPr>
+                <w:rFonts w:ascii="Times New Roman" w:hAnsi="Times New Roman" w:cs="Times New Roman"/>
+              </w:rPr>
+            </w:pPr>
+            <w:r>
+              <w:rPr>
+                <w:rFonts w:ascii="Times New Roman" w:hAnsi="Times New Roman" w:cs="Times New Roman"/>
+              </w:rPr>
+              <w:t>1</w:t>
+            </w:r>
+          </w:p>
+        </w:tc>
+        <w:tc>
+          <w:tcPr>
+            <w:tcW w:w="0" w:type="auto"/>
+            <w:vAlign w:val="center"/>
+            <w:hideMark/>
+          </w:tcPr>
+          <w:p>
+            <w:pPr>
+              <w:jc w:val="center"/>
+              <w:rPr>
+                <w:rFonts w:ascii="Times New Roman" w:hAnsi="Times New Roman" w:cs="Times New Roman"/>
+              </w:rPr>
+            </w:pPr>
+            <w:r>
+              <w:rPr>
+                <w:rFonts w:ascii="Times New Roman" w:hAnsi="Times New Roman" w:cs="Times New Roman"/>
+              </w:rPr>
+              <w:t>1</w:t>
+            </w:r>
+          </w:p>
+        </w:tc>
+        <w:tc>
+          <w:tcPr>
+            <w:tcW w:w="0" w:type="auto"/>
+            <w:vAlign w:val="center"/>
+            <w:hideMark/>
+          </w:tcPr>
+          <w:p>
+            <w:pPr>
+              <w:jc w:val="center"/>
+              <w:rPr>
+                <w:rFonts w:ascii="Times New Roman" w:hAnsi="Times New Roman" w:cs="Times New Roman"/>
+              </w:rPr>
+            </w:pPr>
+            <w:r>
+              <w:rPr>
+                <w:rFonts w:ascii="Times New Roman" w:hAnsi="Times New Roman" w:cs="Times New Roman"/>
+              </w:rPr>
+              <w:t>1</w:t>
+            </w:r>
+          </w:p>
+        </w:tc>
+      </w:tr>
+    </w:tbl>
+    <w:p>
+      <w:pPr>
+        <w:rPr>
+          <w:rFonts w:ascii="Times New Roman" w:hAnsi="Times New Roman" w:cs="Times New Roman"/>
+        </w:rPr>
+      </w:pPr>
+    </w:p>
+    <w:p>
+      <w:pPr>
+        <w:rPr>
+          <w:rFonts w:ascii="Times New Roman" w:hAnsi="Times New Roman" w:cs="Times New Roman"/>
+          <w:b/>
+          <w:bCs/>
+        </w:rPr>
+      </w:pPr>
+      <w:r>
+        <w:rPr>
+          <w:rFonts w:ascii="Times New Roman" w:hAnsi="Times New Roman" w:cs="Times New Roman"/>
+          <w:b/>
+          <w:bCs/>
+        </w:rPr>
+        <w:t>RTL Implementation</w:t>
+      </w:r>
+    </w:p>
+    <w:p>
+      <w:pPr>
+        <w:rPr>
+          <w:rFonts w:ascii="Times New Roman" w:hAnsi="Times New Roman" w:cs="Times New Roman"/>
+        </w:rPr>
+      </w:pPr>
+      <w:r>
+        <w:rPr>
+          <w:rFonts w:ascii="Times New Roman" w:hAnsi="Times New Roman" w:cs="Times New Roman"/>
+        </w:rPr>
+        <w:t xml:space="preserve">The AND gate is implemented using </w:t>
+      </w:r>
+      <w:r>
+        <w:rPr>
+          <w:rFonts w:ascii="Times New Roman" w:hAnsi="Times New Roman" w:cs="Times New Roman"/>
+          <w:b/>
+          <w:bCs/>
+        </w:rPr>
+        <w:t xml:space="preserve">structural </w:t>
+      </w:r>
+      <w:proofErr w:type="spellStart"/>
+      <w:r>
+        <w:rPr>
+          <w:rFonts w:ascii="Times New Roman" w:hAnsi="Times New Roman" w:cs="Times New Roman"/>
+          <w:b/>
+          <w:bCs/>
+        </w:rPr>
+        <w:t>modeling</w:t>
+      </w:r>
+      <w:proofErr w:type="spellEnd"/>
+      <w:r>
+        <w:rPr>
+          <w:rFonts w:ascii="Times New Roman" w:hAnsi="Times New Roman" w:cs="Times New Roman"/>
+        </w:rPr>
+        <w:t xml:space="preserve"> in Verilog HDL by instantiating the previously verified </w:t>
+      </w:r>
+      <w:r>
+        <w:rPr>
+          <w:rFonts w:ascii="Times New Roman" w:hAnsi="Times New Roman" w:cs="Times New Roman"/>
+          <w:b/>
+          <w:bCs/>
+        </w:rPr>
+        <w:t>2-input NAND</w:t>
+      </w:r>
+      <w:r>
+        <w:rPr>
+          <w:rFonts w:ascii="Times New Roman" w:hAnsi="Times New Roman" w:cs="Times New Roman"/>
+        </w:rPr>
+        <w:t xml:space="preserve"> and </w:t>
+      </w:r>
+      <w:r>
+        <w:rPr>
+          <w:rFonts w:ascii="Times New Roman" w:hAnsi="Times New Roman" w:cs="Times New Roman"/>
+          <w:b/>
+          <w:bCs/>
+        </w:rPr>
+        <w:t>Inverter</w:t>
+      </w:r>
+      <w:r>
+        <w:rPr>
+          <w:rFonts w:ascii="Times New Roman" w:hAnsi="Times New Roman" w:cs="Times New Roman"/>
+        </w:rPr>
+        <w:t xml:space="preserve"> modules. The outputs and inputs of these modules are interconnected through an internal wire. The NAND module first computes the complement of the AND operation, and the inverter module subsequently restores the original AND function by inverting the intermediate signal.</w:t>
+      </w:r>
+    </w:p>
+    <w:p>
+      <w:pPr>
+        <w:rPr>
+          <w:rFonts w:ascii="Times New Roman" w:hAnsi="Times New Roman" w:cs="Times New Roman"/>
+        </w:rPr>
+      </w:pPr>
+      <w:r>
+        <w:rPr>
+          <w:rFonts w:ascii="Times New Roman" w:hAnsi="Times New Roman" w:cs="Times New Roman"/>
+        </w:rPr>
+        <w:t>This implementation avoids rewriting the logic expression and instead demonstrates hierarchical hardware design through module instantiation. Such a design approach improves modularity, promotes code reuse, and simplifies maintenance as verified modules can be integrated into larger systems with minimal effort.</w:t>
+      </w:r>
+    </w:p>
+    <w:p>
+      <w:pPr>
+        <w:rPr>
+          <w:rFonts w:ascii="Times New Roman" w:hAnsi="Times New Roman" w:cs="Times New Roman"/>
+          <w:b/>
+          <w:bCs/>
+        </w:rPr>
+      </w:pPr>
+      <w:r>
+        <w:rPr>
+          <w:rFonts w:ascii="Times New Roman" w:hAnsi="Times New Roman" w:cs="Times New Roman"/>
+          <w:b/>
+          <w:bCs/>
+        </w:rPr>
+        <w:t>Working</w:t>
+      </w:r>
+    </w:p>
+    <w:p>
+      <w:pPr>
+        <w:rPr>
+          <w:rFonts w:ascii="Times New Roman" w:hAnsi="Times New Roman" w:cs="Times New Roman"/>
+        </w:rPr>
+      </w:pPr>
+      <w:r>
+        <w:rPr>
+          <w:rFonts w:ascii="Times New Roman" w:hAnsi="Times New Roman" w:cs="Times New Roman"/>
+        </w:rPr>
+        <w:t xml:space="preserve">When inputs </w:t>
+      </w:r>
+      <w:r>
+        <w:rPr>
+          <w:rFonts w:ascii="Times New Roman" w:hAnsi="Times New Roman" w:cs="Times New Roman"/>
+          <w:b/>
+          <w:bCs/>
+        </w:rPr>
+        <w:t>A</w:t>
+      </w:r>
+      <w:r>
+        <w:rPr>
+          <w:rFonts w:ascii="Times New Roman" w:hAnsi="Times New Roman" w:cs="Times New Roman"/>
+        </w:rPr>
+        <w:t xml:space="preserve"> and </w:t>
+      </w:r>
+      <w:r>
+        <w:rPr>
+          <w:rFonts w:ascii="Times New Roman" w:hAnsi="Times New Roman" w:cs="Times New Roman"/>
+          <w:b/>
+          <w:bCs/>
+        </w:rPr>
+        <w:t>B</w:t>
+      </w:r>
+      <w:r>
+        <w:rPr>
+          <w:rFonts w:ascii="Times New Roman" w:hAnsi="Times New Roman" w:cs="Times New Roman"/>
+        </w:rPr>
+        <w:t xml:space="preserve"> are applied, the NAND module generates the inverted AND output. This intermediate output is then passed to the inverter, which produces the final AND output. As a result, the output becomes logic '1' only when both inputs are logic '1'. For all other </w:t>
+      </w:r>
+      <w:r>
+        <w:rPr>
+          <w:rFonts w:ascii="Times New Roman" w:hAnsi="Times New Roman" w:cs="Times New Roman"/>
+        </w:rPr>
+        <w:lastRenderedPageBreak/>
+        <w:t xml:space="preserve">input combinations, the output remains logic '0'. During simulation, the output changes immediately in response to input transitions, confirming the combinational </w:t>
+      </w:r>
+      <w:proofErr w:type="spellStart"/>
+      <w:r>
+        <w:rPr>
+          <w:rFonts w:ascii="Times New Roman" w:hAnsi="Times New Roman" w:cs="Times New Roman"/>
+        </w:rPr>
+        <w:t>behavior</w:t>
+      </w:r>
+      <w:proofErr w:type="spellEnd"/>
+      <w:r>
+        <w:rPr>
+          <w:rFonts w:ascii="Times New Roman" w:hAnsi="Times New Roman" w:cs="Times New Roman"/>
+        </w:rPr>
+        <w:t xml:space="preserve"> and correct interaction between the instantiated modules.</w:t>
+      </w:r>
+    </w:p>
+    <w:p>
+      <w:pPr>
+        <w:rPr>
+          <w:rFonts w:ascii="Times New Roman" w:hAnsi="Times New Roman" w:cs="Times New Roman"/>
+          <w:b/>
+          <w:bCs/>
+        </w:rPr>
+      </w:pPr>
+      <w:r>
+        <w:rPr>
+          <w:rFonts w:ascii="Times New Roman" w:hAnsi="Times New Roman" w:cs="Times New Roman"/>
+          <w:b/>
+          <w:bCs/>
+        </w:rPr>
+        <w:t>Applications</w:t>
+      </w:r>
+    </w:p>
+    <w:p>
+      <w:pPr>
+        <w:numPr>
+          <w:ilvl w:val="0"/>
+          <w:numId w:val="8"/>
+        </w:numPr>
+        <w:rPr>
+          <w:rFonts w:ascii="Times New Roman" w:hAnsi="Times New Roman" w:cs="Times New Roman"/>
+        </w:rPr>
+      </w:pPr>
+      <w:r>
+        <w:rPr>
+          <w:rFonts w:ascii="Times New Roman" w:hAnsi="Times New Roman" w:cs="Times New Roman"/>
+        </w:rPr>
+        <w:t xml:space="preserve">Logical operations in Arithmetic Logic Units (ALUs). </w:t>
+      </w:r>
+    </w:p>
+    <w:p>
+      <w:pPr>
+        <w:numPr>
+          <w:ilvl w:val="0"/>
+          <w:numId w:val="8"/>
+        </w:numPr>
+        <w:rPr>
+          <w:rFonts w:ascii="Times New Roman" w:hAnsi="Times New Roman" w:cs="Times New Roman"/>
+        </w:rPr>
+      </w:pPr>
+      <w:r>
+        <w:rPr>
+          <w:rFonts w:ascii="Times New Roman" w:hAnsi="Times New Roman" w:cs="Times New Roman"/>
+        </w:rPr>
+        <w:t xml:space="preserve">Enable signal generation. </w:t>
+      </w:r>
+    </w:p>
+    <w:p>
+      <w:pPr>
+        <w:numPr>
+          <w:ilvl w:val="0"/>
+          <w:numId w:val="8"/>
+        </w:numPr>
+        <w:rPr>
+          <w:rFonts w:ascii="Times New Roman" w:hAnsi="Times New Roman" w:cs="Times New Roman"/>
+        </w:rPr>
+      </w:pPr>
+      <w:r>
+        <w:rPr>
+          <w:rFonts w:ascii="Times New Roman" w:hAnsi="Times New Roman" w:cs="Times New Roman"/>
+        </w:rPr>
+        <w:t xml:space="preserve">Control logic in processors. </w:t>
+      </w:r>
+    </w:p>
+    <w:p>
+      <w:pPr>
+        <w:numPr>
+          <w:ilvl w:val="0"/>
+          <w:numId w:val="8"/>
+        </w:numPr>
+        <w:rPr>
+          <w:rFonts w:ascii="Times New Roman" w:hAnsi="Times New Roman" w:cs="Times New Roman"/>
+        </w:rPr>
+      </w:pPr>
+      <w:r>
+        <w:rPr>
+          <w:rFonts w:ascii="Times New Roman" w:hAnsi="Times New Roman" w:cs="Times New Roman"/>
+        </w:rPr>
+        <w:t xml:space="preserve">Data masking and conditional execution. </w:t>
+      </w:r>
+    </w:p>
+    <w:p>
+      <w:pPr>
+        <w:numPr>
+          <w:ilvl w:val="0"/>
+          <w:numId w:val="8"/>
+        </w:numPr>
+        <w:rPr>
+          <w:rFonts w:ascii="Times New Roman" w:hAnsi="Times New Roman" w:cs="Times New Roman"/>
+        </w:rPr>
+      </w:pPr>
+      <w:r>
+        <w:rPr>
+          <w:rFonts w:ascii="Times New Roman" w:hAnsi="Times New Roman" w:cs="Times New Roman"/>
+        </w:rPr>
+        <w:t xml:space="preserve">Combinational logic design. </w:t>
+      </w:r>
+    </w:p>
+    <w:p>
+      <w:pPr>
+        <w:numPr>
+          <w:ilvl w:val="0"/>
+          <w:numId w:val="8"/>
+        </w:numPr>
+        <w:rPr>
+          <w:rFonts w:ascii="Times New Roman" w:hAnsi="Times New Roman" w:cs="Times New Roman"/>
+        </w:rPr>
+      </w:pPr>
+      <w:r>
+        <w:rPr>
+          <w:rFonts w:ascii="Times New Roman" w:hAnsi="Times New Roman" w:cs="Times New Roman"/>
+        </w:rPr>
+        <w:t xml:space="preserve">Building larger digital systems using hierarchical modules. </w:t>
+      </w:r>
+    </w:p>
+    <w:p>
+      <w:pPr>
+        <w:rPr>
+          <w:rFonts w:ascii="Times New Roman" w:hAnsi="Times New Roman" w:cs="Times New Roman"/>
+          <w:b/>
+          <w:bCs/>
+        </w:rPr>
+      </w:pPr>
+      <w:r>
+        <w:rPr>
+          <w:rFonts w:ascii="Times New Roman" w:hAnsi="Times New Roman" w:cs="Times New Roman"/>
+          <w:b/>
+          <w:bCs/>
+        </w:rPr>
+        <w:t>Advantages</w:t>
+      </w:r>
+    </w:p>
+    <w:p>
+      <w:pPr>
+        <w:numPr>
+          <w:ilvl w:val="0"/>
+          <w:numId w:val="9"/>
+        </w:numPr>
+        <w:rPr>
+          <w:rFonts w:ascii="Times New Roman" w:hAnsi="Times New Roman" w:cs="Times New Roman"/>
+        </w:rPr>
+      </w:pPr>
+      <w:r>
+        <w:rPr>
+          <w:rFonts w:ascii="Times New Roman" w:hAnsi="Times New Roman" w:cs="Times New Roman"/>
+        </w:rPr>
+        <w:t xml:space="preserve">Demonstrates hierarchical and structural RTL design. </w:t>
+      </w:r>
+    </w:p>
+    <w:p>
+      <w:pPr>
+        <w:numPr>
+          <w:ilvl w:val="0"/>
+          <w:numId w:val="9"/>
+        </w:numPr>
+        <w:rPr>
+          <w:rFonts w:ascii="Times New Roman" w:hAnsi="Times New Roman" w:cs="Times New Roman"/>
+        </w:rPr>
+      </w:pPr>
+      <w:r>
+        <w:rPr>
+          <w:rFonts w:ascii="Times New Roman" w:hAnsi="Times New Roman" w:cs="Times New Roman"/>
+        </w:rPr>
+        <w:t xml:space="preserve">Promotes module reusability and code modularity. </w:t>
+      </w:r>
+    </w:p>
+    <w:p>
+      <w:pPr>
+        <w:numPr>
+          <w:ilvl w:val="0"/>
+          <w:numId w:val="9"/>
+        </w:numPr>
+        <w:rPr>
+          <w:rFonts w:ascii="Times New Roman" w:hAnsi="Times New Roman" w:cs="Times New Roman"/>
+        </w:rPr>
+      </w:pPr>
+      <w:r>
+        <w:rPr>
+          <w:rFonts w:ascii="Times New Roman" w:hAnsi="Times New Roman" w:cs="Times New Roman"/>
+        </w:rPr>
+        <w:t xml:space="preserve">Simplifies debugging by reusing previously verified modules. </w:t>
+      </w:r>
+    </w:p>
+    <w:p>
+      <w:pPr>
+        <w:numPr>
+          <w:ilvl w:val="0"/>
+          <w:numId w:val="9"/>
+        </w:numPr>
+        <w:rPr>
+          <w:rFonts w:ascii="Times New Roman" w:hAnsi="Times New Roman" w:cs="Times New Roman"/>
+        </w:rPr>
+      </w:pPr>
+      <w:r>
+        <w:rPr>
+          <w:rFonts w:ascii="Times New Roman" w:hAnsi="Times New Roman" w:cs="Times New Roman"/>
+        </w:rPr>
+        <w:t xml:space="preserve">Improves scalability for larger digital systems. </w:t>
+      </w:r>
+    </w:p>
+    <w:p>
+      <w:pPr>
+        <w:numPr>
+          <w:ilvl w:val="0"/>
+          <w:numId w:val="9"/>
+        </w:numPr>
+        <w:rPr>
+          <w:rFonts w:ascii="Times New Roman" w:hAnsi="Times New Roman" w:cs="Times New Roman"/>
+        </w:rPr>
+      </w:pPr>
+      <w:r>
+        <w:rPr>
+          <w:rFonts w:ascii="Times New Roman" w:hAnsi="Times New Roman" w:cs="Times New Roman"/>
+        </w:rPr>
+        <w:t xml:space="preserve">Reduces development time by avoiding redundant code. </w:t>
+      </w:r>
+    </w:p>
+    <w:p>
+      <w:pPr>
+        <w:rPr>
+          <w:rFonts w:ascii="Times New Roman" w:hAnsi="Times New Roman" w:cs="Times New Roman"/>
+          <w:b/>
+          <w:bCs/>
+        </w:rPr>
+      </w:pPr>
+      <w:r>
+        <w:rPr>
+          <w:rFonts w:ascii="Times New Roman" w:hAnsi="Times New Roman" w:cs="Times New Roman"/>
+          <w:b/>
+          <w:bCs/>
+        </w:rPr>
+        <w:t>Limitations</w:t>
+      </w:r>
+    </w:p>
+    <w:p>
+      <w:pPr>
+        <w:numPr>
+          <w:ilvl w:val="0"/>
+          <w:numId w:val="10"/>
+        </w:numPr>
+        <w:rPr>
+          <w:rFonts w:ascii="Times New Roman" w:hAnsi="Times New Roman" w:cs="Times New Roman"/>
+        </w:rPr>
+      </w:pPr>
+      <w:r>
+        <w:rPr>
+          <w:rFonts w:ascii="Times New Roman" w:hAnsi="Times New Roman" w:cs="Times New Roman"/>
+        </w:rPr>
+        <w:t xml:space="preserve">Requires additional hardware compared to a direct AND implementation. </w:t>
+      </w:r>
+    </w:p>
+    <w:p>
+      <w:pPr>
+        <w:numPr>
+          <w:ilvl w:val="0"/>
+          <w:numId w:val="10"/>
+        </w:numPr>
+        <w:rPr>
+          <w:rFonts w:ascii="Times New Roman" w:hAnsi="Times New Roman" w:cs="Times New Roman"/>
+        </w:rPr>
+      </w:pPr>
+      <w:r>
+        <w:rPr>
+          <w:rFonts w:ascii="Times New Roman" w:hAnsi="Times New Roman" w:cs="Times New Roman"/>
+        </w:rPr>
+        <w:t xml:space="preserve">Introduces a slightly higher propagation delay due to cascading two modules. </w:t>
+      </w:r>
+    </w:p>
+    <w:p>
+      <w:pPr>
+        <w:numPr>
+          <w:ilvl w:val="0"/>
+          <w:numId w:val="10"/>
+        </w:numPr>
+        <w:rPr>
+          <w:rFonts w:ascii="Times New Roman" w:hAnsi="Times New Roman" w:cs="Times New Roman"/>
+        </w:rPr>
+      </w:pPr>
+      <w:r>
+        <w:rPr>
+          <w:rFonts w:ascii="Times New Roman" w:hAnsi="Times New Roman" w:cs="Times New Roman"/>
+        </w:rPr>
+        <w:t xml:space="preserve">Depends on the correct functionality of the NAND and Inverter modules. </w:t>
+      </w:r>
+    </w:p>
+    <w:p>
+      <w:pPr>
+        <w:rPr>
+          <w:rFonts w:ascii="Times New Roman" w:hAnsi="Times New Roman" w:cs="Times New Roman"/>
+          <w:b/>
+          <w:bCs/>
+        </w:rPr>
+      </w:pPr>
+      <w:r>
+        <w:rPr>
+          <w:rFonts w:ascii="Times New Roman" w:hAnsi="Times New Roman" w:cs="Times New Roman"/>
+          <w:b/>
+          <w:bCs/>
+        </w:rPr>
+        <w:t>Role in the 2-Bit Microprocessor</w:t>
+      </w:r>
+    </w:p>
+    <w:p>
+      <w:pPr>
+        <w:rPr>
+          <w:rFonts w:ascii="Times New Roman" w:hAnsi="Times New Roman" w:cs="Times New Roman"/>
+        </w:rPr>
+      </w:pPr>
+      <w:r>
+        <w:rPr>
+          <w:rFonts w:ascii="Times New Roman" w:hAnsi="Times New Roman" w:cs="Times New Roman"/>
+        </w:rPr>
+        <w:t xml:space="preserve">The AND gate is used to perform logical operations required by the processor's </w:t>
+      </w:r>
+      <w:proofErr w:type="spellStart"/>
+      <w:r>
+        <w:rPr>
+          <w:rFonts w:ascii="Times New Roman" w:hAnsi="Times New Roman" w:cs="Times New Roman"/>
+        </w:rPr>
+        <w:t>datapath</w:t>
+      </w:r>
+      <w:proofErr w:type="spellEnd"/>
+      <w:r>
+        <w:rPr>
+          <w:rFonts w:ascii="Times New Roman" w:hAnsi="Times New Roman" w:cs="Times New Roman"/>
+        </w:rPr>
+        <w:t xml:space="preserve"> and Arithmetic Logic Unit (ALU). It is also employed in generating enable signals, implementing control logic, and supporting decision-making operations. Constructing the AND gate using previously verified modules demonstrates the hierarchical design methodology adopted throughout the development of the 2-bit microprocessor.</w:t>
+      </w:r>
+    </w:p>
+    <w:p>
+      <w:pPr>
+        <w:rPr>
+          <w:rFonts w:ascii="Times New Roman" w:hAnsi="Times New Roman" w:cs="Times New Roman"/>
+          <w:b/>
+          <w:bCs/>
+        </w:rPr>
+      </w:pPr>
+      <w:r>
+        <w:rPr>
+          <w:rFonts w:ascii="Times New Roman" w:hAnsi="Times New Roman" w:cs="Times New Roman"/>
+          <w:b/>
+          <w:bCs/>
+        </w:rPr>
+        <w:t>Verification Summary</w:t>
+      </w:r>
+    </w:p>
+    <w:p>
+      <w:pPr>
+        <w:rPr>
+          <w:rFonts w:ascii="Times New Roman" w:hAnsi="Times New Roman" w:cs="Times New Roman"/>
+        </w:rPr>
+      </w:pPr>
+      <w:r>
+        <w:rPr>
+          <w:rFonts w:ascii="Times New Roman" w:hAnsi="Times New Roman" w:cs="Times New Roman"/>
+        </w:rPr>
+        <w:t xml:space="preserve">The functionality of the structural AND gate was verified using a dedicated Verilog testbench. All possible input combinations were applied, and the output waveforms were </w:t>
+      </w:r>
+      <w:proofErr w:type="spellStart"/>
+      <w:r>
+        <w:rPr>
+          <w:rFonts w:ascii="Times New Roman" w:hAnsi="Times New Roman" w:cs="Times New Roman"/>
+        </w:rPr>
+        <w:t>analyzed</w:t>
+      </w:r>
+      <w:proofErr w:type="spellEnd"/>
+      <w:r>
+        <w:rPr>
+          <w:rFonts w:ascii="Times New Roman" w:hAnsi="Times New Roman" w:cs="Times New Roman"/>
+        </w:rPr>
+        <w:t>. The simulation results confirmed that the instantiated NAND and Inverter modules collectively produced the correct AND operation for every input combination, validating both the structural implementation and the interaction between the reused modules.</w:t>
+      </w:r>
+    </w:p>
+    <w:p>
+      <w:pPr>
+        <w:rPr>
+          <w:rFonts w:ascii="Times New Roman" w:hAnsi="Times New Roman" w:cs="Times New Roman"/>
+          <w:b/>
+          <w:bCs/>
+        </w:rPr>
+      </w:pPr>
+      <w:r>
+        <w:rPr>
+          <w:rFonts w:ascii="Times New Roman" w:hAnsi="Times New Roman" w:cs="Times New Roman"/>
+          <w:b/>
+          <w:bCs/>
+        </w:rPr>
+        <w:lastRenderedPageBreak/>
+        <w:t>Conclusion</w:t>
+      </w:r>
+    </w:p>
+    <w:p>
+      <w:pPr>
+        <w:rPr>
+          <w:rFonts w:ascii="Times New Roman" w:hAnsi="Times New Roman" w:cs="Times New Roman"/>
+        </w:rPr>
+      </w:pPr>
+      <w:r>
+        <w:rPr>
+          <w:rFonts w:ascii="Times New Roman" w:hAnsi="Times New Roman" w:cs="Times New Roman"/>
+        </w:rPr>
+        <w:t xml:space="preserve">The 2-input AND gate was successfully implemented using the previously designed NAND and Inverter modules through structural </w:t>
+      </w:r>
+      <w:proofErr w:type="spellStart"/>
+      <w:r>
+        <w:rPr>
+          <w:rFonts w:ascii="Times New Roman" w:hAnsi="Times New Roman" w:cs="Times New Roman"/>
+        </w:rPr>
+        <w:t>modeling</w:t>
+      </w:r>
+      <w:proofErr w:type="spellEnd"/>
+      <w:r>
+        <w:rPr>
+          <w:rFonts w:ascii="Times New Roman" w:hAnsi="Times New Roman" w:cs="Times New Roman"/>
+        </w:rPr>
+        <w:t xml:space="preserve"> in Verilog HDL. This implementation highlights the principles of hierarchical design and module reusability, which are essential in modern digital system development. Simulation results verified the correctness of the design, making the module a reliable component for integration into the 2-bit microprocessor.</w:t>
+      </w:r>
+    </w:p>
+    <w:p>
+      <w:pPr>
+        <w:rPr>
+          <w:rFonts w:ascii="Times New Roman" w:hAnsi="Times New Roman" w:cs="Times New Roman"/>
+        </w:rPr>
+      </w:pPr>
+      <w:r>
+        <w:rPr>
+          <w:rFonts w:ascii="Times New Roman" w:hAnsi="Times New Roman" w:cs="Times New Roman"/>
+          <w:b/>
+          <w:bCs/>
+        </w:rPr>
+        <w:t xml:space="preserve">Diagram: </w:t>
+      </w:r>
+    </w:p>
+    <w:p>
+      <w:pPr>
+        <w:jc w:val="center"/>
+        <w:rPr>
+          <w:rFonts w:ascii="Times New Roman" w:hAnsi="Times New Roman" w:cs="Times New Roman"/>
+        </w:rPr>
+      </w:pPr>
+      <w:r>
+        <w:rPr>
+          <w:rFonts w:ascii="Times New Roman" w:hAnsi="Times New Roman" w:cs="Times New Roman"/>
+        </w:rPr>
+        <w:drawing>
+          <wp:inline distT="0" distB="0" distL="0" distR="0" wp14:anchorId="2DF7DC73" wp14:editId="555BFC95">
+            <wp:extent cx="4404742" cy="1615580"/>
+            <wp:effectExtent l="19050" t="19050" r="15240" b="22860"/>
+            <wp:docPr id="1004294815" name="Picture 1"/>
+            <wp:cNvGraphicFramePr>
+              <a:graphicFrameLocks xmlns:a="http://schemas.openxmlformats.org/drawingml/2006/main" noChangeAspect="1"/>
+            </wp:cNvGraphicFramePr>
+            <a:graphic xmlns:a="http://schemas.openxmlformats.org/drawingml/2006/main">
+              <a:graphicData uri="http://schemas.openxmlformats.org/drawingml/2006/picture">
+                <pic:pic xmlns:pic="http://schemas.openxmlformats.org/drawingml/2006/picture">
+                  <pic:nvPicPr>
+                    <pic:cNvPr id="1004294815" name=""/>
+                    <pic:cNvPicPr/>
+                  </pic:nvPicPr>
+                  <pic:blipFill>
+                    <a:blip r:embed="rId7"/>
+                    <a:stretch>
+                      <a:fillRect/>
+                    </a:stretch>
+                  </pic:blipFill>
+                  <pic:spPr>
+                    <a:xfrm>
+                      <a:off x="0" y="0"/>
+                      <a:ext cx="4404742" cy="1615580"/>
+                    </a:xfrm>
+                    <a:prstGeom prst="rect">
+                      <a:avLst/>
+                    </a:prstGeom>
+                    <a:ln>
+                      <a:solidFill>
+                        <a:schemeClr val="accent1"/>
+                      </a:solidFill>
+                    </a:ln>
+                  </pic:spPr>
+                </pic:pic>
+              </a:graphicData>
+            </a:graphic>
           </wp:inline>
         </w:drawing>
       </w:r>
-    </w:p>
-    <w:p>
-      <w:pPr>
-        <w:rPr>
-          <w:rFonts w:ascii="Times New Roman" w:hAnsi="Times New Roman" w:cs="Times New Roman"/>
-        </w:rPr>
-      </w:pPr>
       <w:r>
         <w:rPr>
           <w:rFonts w:ascii="Times New Roman" w:hAnsi="Times New Roman" w:cs="Times New Roman"/>
         </w:rPr>
         <w:br w:type="page"/>
-      </w:r>
-      <w:r>
-        <w:rPr>
-          <w:rFonts w:ascii="Times New Roman" w:hAnsi="Times New Roman" w:cs="Times New Roman"/>
-        </w:rPr>
-        <w:lastRenderedPageBreak/>
-        <w:t xml:space="preserve"> </w:t>
       </w:r>
     </w:p>
     <w:p>
@@ -2890,6 +4588,7 @@
         <w:rPr>
           <w:rFonts w:ascii="Times New Roman" w:hAnsi="Times New Roman" w:cs="Times New Roman"/>
         </w:rPr>
+        <w:lastRenderedPageBreak/>
         <w:t>Chapter04</w:t>
       </w:r>
     </w:p>
@@ -3369,6 +5068,155 @@
     </w:lvl>
   </w:abstractNum>
   <w:abstractNum w:abstractNumId="2" w15:restartNumberingAfterBreak="0">
+    <w:nsid w:val="5BA17090"/>
+    <w:multiLevelType w:val="multilevel"/>
+    <w:tmpl w:val="1FD817FE"/>
+    <w:lvl w:ilvl="0">
+      <w:start w:val="1"/>
+      <w:numFmt w:val="bullet"/>
+      <w:lvlText w:val=""/>
+      <w:lvlJc w:val="left"/>
+      <w:pPr>
+        <w:tabs>
+          <w:tab w:val="num" w:pos="720"/>
+        </w:tabs>
+        <w:ind w:left="720" w:hanging="360"/>
+      </w:pPr>
+      <w:rPr>
+        <w:rFonts w:ascii="Symbol" w:hAnsi="Symbol" w:hint="default"/>
+        <w:sz w:val="20"/>
+      </w:rPr>
+    </w:lvl>
+    <w:lvl w:ilvl="1" w:tentative="1">
+      <w:start w:val="1"/>
+      <w:numFmt w:val="bullet"/>
+      <w:lvlText w:val="o"/>
+      <w:lvlJc w:val="left"/>
+      <w:pPr>
+        <w:tabs>
+          <w:tab w:val="num" w:pos="1440"/>
+        </w:tabs>
+        <w:ind w:left="1440" w:hanging="360"/>
+      </w:pPr>
+      <w:rPr>
+        <w:rFonts w:ascii="Courier New" w:hAnsi="Courier New" w:hint="default"/>
+        <w:sz w:val="20"/>
+      </w:rPr>
+    </w:lvl>
+    <w:lvl w:ilvl="2" w:tentative="1">
+      <w:start w:val="1"/>
+      <w:numFmt w:val="bullet"/>
+      <w:lvlText w:val=""/>
+      <w:lvlJc w:val="left"/>
+      <w:pPr>
+        <w:tabs>
+          <w:tab w:val="num" w:pos="2160"/>
+        </w:tabs>
+        <w:ind w:left="2160" w:hanging="360"/>
+      </w:pPr>
+      <w:rPr>
+        <w:rFonts w:ascii="Wingdings" w:hAnsi="Wingdings" w:hint="default"/>
+        <w:sz w:val="20"/>
+      </w:rPr>
+    </w:lvl>
+    <w:lvl w:ilvl="3" w:tentative="1">
+      <w:start w:val="1"/>
+      <w:numFmt w:val="bullet"/>
+      <w:lvlText w:val=""/>
+      <w:lvlJc w:val="left"/>
+      <w:pPr>
+        <w:tabs>
+          <w:tab w:val="num" w:pos="2880"/>
+        </w:tabs>
+        <w:ind w:left="2880" w:hanging="360"/>
+      </w:pPr>
+      <w:rPr>
+        <w:rFonts w:ascii="Wingdings" w:hAnsi="Wingdings" w:hint="default"/>
+        <w:sz w:val="20"/>
+      </w:rPr>
+    </w:lvl>
+    <w:lvl w:ilvl="4" w:tentative="1">
+      <w:start w:val="1"/>
+      <w:numFmt w:val="bullet"/>
+      <w:lvlText w:val=""/>
+      <w:lvlJc w:val="left"/>
+      <w:pPr>
+        <w:tabs>
+          <w:tab w:val="num" w:pos="3600"/>
+        </w:tabs>
+        <w:ind w:left="3600" w:hanging="360"/>
+      </w:pPr>
+      <w:rPr>
+        <w:rFonts w:ascii="Wingdings" w:hAnsi="Wingdings" w:hint="default"/>
+        <w:sz w:val="20"/>
+      </w:rPr>
+    </w:lvl>
+    <w:lvl w:ilvl="5" w:tentative="1">
+      <w:start w:val="1"/>
+      <w:numFmt w:val="bullet"/>
+      <w:lvlText w:val=""/>
+      <w:lvlJc w:val="left"/>
+      <w:pPr>
+        <w:tabs>
+          <w:tab w:val="num" w:pos="4320"/>
+        </w:tabs>
+        <w:ind w:left="4320" w:hanging="360"/>
+      </w:pPr>
+      <w:rPr>
+        <w:rFonts w:ascii="Wingdings" w:hAnsi="Wingdings" w:hint="default"/>
+        <w:sz w:val="20"/>
+      </w:rPr>
+    </w:lvl>
+    <w:lvl w:ilvl="6" w:tentative="1">
+      <w:start w:val="1"/>
+      <w:numFmt w:val="bullet"/>
+      <w:lvlText w:val=""/>
+      <w:lvlJc w:val="left"/>
+      <w:pPr>
+        <w:tabs>
+          <w:tab w:val="num" w:pos="5040"/>
+        </w:tabs>
+        <w:ind w:left="5040" w:hanging="360"/>
+      </w:pPr>
+      <w:rPr>
+        <w:rFonts w:ascii="Wingdings" w:hAnsi="Wingdings" w:hint="default"/>
+        <w:sz w:val="20"/>
+      </w:rPr>
+    </w:lvl>
+    <w:lvl w:ilvl="7" w:tentative="1">
+      <w:start w:val="1"/>
+      <w:numFmt w:val="bullet"/>
+      <w:lvlText w:val=""/>
+      <w:lvlJc w:val="left"/>
+      <w:pPr>
+        <w:tabs>
+          <w:tab w:val="num" w:pos="5760"/>
+        </w:tabs>
+        <w:ind w:left="5760" w:hanging="360"/>
+      </w:pPr>
+      <w:rPr>
+        <w:rFonts w:ascii="Wingdings" w:hAnsi="Wingdings" w:hint="default"/>
+        <w:sz w:val="20"/>
+      </w:rPr>
+    </w:lvl>
+    <w:lvl w:ilvl="8" w:tentative="1">
+      <w:start w:val="1"/>
+      <w:numFmt w:val="bullet"/>
+      <w:lvlText w:val=""/>
+      <w:lvlJc w:val="left"/>
+      <w:pPr>
+        <w:tabs>
+          <w:tab w:val="num" w:pos="6480"/>
+        </w:tabs>
+        <w:ind w:left="6480" w:hanging="360"/>
+      </w:pPr>
+      <w:rPr>
+        <w:rFonts w:ascii="Wingdings" w:hAnsi="Wingdings" w:hint="default"/>
+        <w:sz w:val="20"/>
+      </w:rPr>
+    </w:lvl>
+  </w:abstractNum>
+  <w:abstractNum w:abstractNumId="3" w15:restartNumberingAfterBreak="0">
     <w:nsid w:val="5E832212"/>
     <w:multiLevelType w:val="multilevel"/>
     <w:tmpl w:val="8438EB16"/>
@@ -3517,7 +5365,7 @@
       </w:rPr>
     </w:lvl>
   </w:abstractNum>
-  <w:abstractNum w:abstractNumId="3" w15:restartNumberingAfterBreak="0">
+  <w:abstractNum w:abstractNumId="4" w15:restartNumberingAfterBreak="0">
     <w:nsid w:val="60AD1E24"/>
     <w:multiLevelType w:val="multilevel"/>
     <w:tmpl w:val="F320B762"/>
@@ -3666,7 +5514,305 @@
       </w:rPr>
     </w:lvl>
   </w:abstractNum>
-  <w:abstractNum w:abstractNumId="4" w15:restartNumberingAfterBreak="0">
+  <w:abstractNum w:abstractNumId="5" w15:restartNumberingAfterBreak="0">
+    <w:nsid w:val="6759054E"/>
+    <w:multiLevelType w:val="multilevel"/>
+    <w:tmpl w:val="3D68103E"/>
+    <w:lvl w:ilvl="0">
+      <w:start w:val="1"/>
+      <w:numFmt w:val="bullet"/>
+      <w:lvlText w:val=""/>
+      <w:lvlJc w:val="left"/>
+      <w:pPr>
+        <w:tabs>
+          <w:tab w:val="num" w:pos="720"/>
+        </w:tabs>
+        <w:ind w:left="720" w:hanging="360"/>
+      </w:pPr>
+      <w:rPr>
+        <w:rFonts w:ascii="Symbol" w:hAnsi="Symbol" w:hint="default"/>
+        <w:sz w:val="20"/>
+      </w:rPr>
+    </w:lvl>
+    <w:lvl w:ilvl="1" w:tentative="1">
+      <w:start w:val="1"/>
+      <w:numFmt w:val="bullet"/>
+      <w:lvlText w:val="o"/>
+      <w:lvlJc w:val="left"/>
+      <w:pPr>
+        <w:tabs>
+          <w:tab w:val="num" w:pos="1440"/>
+        </w:tabs>
+        <w:ind w:left="1440" w:hanging="360"/>
+      </w:pPr>
+      <w:rPr>
+        <w:rFonts w:ascii="Courier New" w:hAnsi="Courier New" w:hint="default"/>
+        <w:sz w:val="20"/>
+      </w:rPr>
+    </w:lvl>
+    <w:lvl w:ilvl="2" w:tentative="1">
+      <w:start w:val="1"/>
+      <w:numFmt w:val="bullet"/>
+      <w:lvlText w:val=""/>
+      <w:lvlJc w:val="left"/>
+      <w:pPr>
+        <w:tabs>
+          <w:tab w:val="num" w:pos="2160"/>
+        </w:tabs>
+        <w:ind w:left="2160" w:hanging="360"/>
+      </w:pPr>
+      <w:rPr>
+        <w:rFonts w:ascii="Wingdings" w:hAnsi="Wingdings" w:hint="default"/>
+        <w:sz w:val="20"/>
+      </w:rPr>
+    </w:lvl>
+    <w:lvl w:ilvl="3" w:tentative="1">
+      <w:start w:val="1"/>
+      <w:numFmt w:val="bullet"/>
+      <w:lvlText w:val=""/>
+      <w:lvlJc w:val="left"/>
+      <w:pPr>
+        <w:tabs>
+          <w:tab w:val="num" w:pos="2880"/>
+        </w:tabs>
+        <w:ind w:left="2880" w:hanging="360"/>
+      </w:pPr>
+      <w:rPr>
+        <w:rFonts w:ascii="Wingdings" w:hAnsi="Wingdings" w:hint="default"/>
+        <w:sz w:val="20"/>
+      </w:rPr>
+    </w:lvl>
+    <w:lvl w:ilvl="4" w:tentative="1">
+      <w:start w:val="1"/>
+      <w:numFmt w:val="bullet"/>
+      <w:lvlText w:val=""/>
+      <w:lvlJc w:val="left"/>
+      <w:pPr>
+        <w:tabs>
+          <w:tab w:val="num" w:pos="3600"/>
+        </w:tabs>
+        <w:ind w:left="3600" w:hanging="360"/>
+      </w:pPr>
+      <w:rPr>
+        <w:rFonts w:ascii="Wingdings" w:hAnsi="Wingdings" w:hint="default"/>
+        <w:sz w:val="20"/>
+      </w:rPr>
+    </w:lvl>
+    <w:lvl w:ilvl="5" w:tentative="1">
+      <w:start w:val="1"/>
+      <w:numFmt w:val="bullet"/>
+      <w:lvlText w:val=""/>
+      <w:lvlJc w:val="left"/>
+      <w:pPr>
+        <w:tabs>
+          <w:tab w:val="num" w:pos="4320"/>
+        </w:tabs>
+        <w:ind w:left="4320" w:hanging="360"/>
+      </w:pPr>
+      <w:rPr>
+        <w:rFonts w:ascii="Wingdings" w:hAnsi="Wingdings" w:hint="default"/>
+        <w:sz w:val="20"/>
+      </w:rPr>
+    </w:lvl>
+    <w:lvl w:ilvl="6" w:tentative="1">
+      <w:start w:val="1"/>
+      <w:numFmt w:val="bullet"/>
+      <w:lvlText w:val=""/>
+      <w:lvlJc w:val="left"/>
+      <w:pPr>
+        <w:tabs>
+          <w:tab w:val="num" w:pos="5040"/>
+        </w:tabs>
+        <w:ind w:left="5040" w:hanging="360"/>
+      </w:pPr>
+      <w:rPr>
+        <w:rFonts w:ascii="Wingdings" w:hAnsi="Wingdings" w:hint="default"/>
+        <w:sz w:val="20"/>
+      </w:rPr>
+    </w:lvl>
+    <w:lvl w:ilvl="7" w:tentative="1">
+      <w:start w:val="1"/>
+      <w:numFmt w:val="bullet"/>
+      <w:lvlText w:val=""/>
+      <w:lvlJc w:val="left"/>
+      <w:pPr>
+        <w:tabs>
+          <w:tab w:val="num" w:pos="5760"/>
+        </w:tabs>
+        <w:ind w:left="5760" w:hanging="360"/>
+      </w:pPr>
+      <w:rPr>
+        <w:rFonts w:ascii="Wingdings" w:hAnsi="Wingdings" w:hint="default"/>
+        <w:sz w:val="20"/>
+      </w:rPr>
+    </w:lvl>
+    <w:lvl w:ilvl="8" w:tentative="1">
+      <w:start w:val="1"/>
+      <w:numFmt w:val="bullet"/>
+      <w:lvlText w:val=""/>
+      <w:lvlJc w:val="left"/>
+      <w:pPr>
+        <w:tabs>
+          <w:tab w:val="num" w:pos="6480"/>
+        </w:tabs>
+        <w:ind w:left="6480" w:hanging="360"/>
+      </w:pPr>
+      <w:rPr>
+        <w:rFonts w:ascii="Wingdings" w:hAnsi="Wingdings" w:hint="default"/>
+        <w:sz w:val="20"/>
+      </w:rPr>
+    </w:lvl>
+  </w:abstractNum>
+  <w:abstractNum w:abstractNumId="6" w15:restartNumberingAfterBreak="0">
+    <w:nsid w:val="6E5B5E8F"/>
+    <w:multiLevelType w:val="multilevel"/>
+    <w:tmpl w:val="C8C4A296"/>
+    <w:lvl w:ilvl="0">
+      <w:start w:val="1"/>
+      <w:numFmt w:val="bullet"/>
+      <w:lvlText w:val=""/>
+      <w:lvlJc w:val="left"/>
+      <w:pPr>
+        <w:tabs>
+          <w:tab w:val="num" w:pos="720"/>
+        </w:tabs>
+        <w:ind w:left="720" w:hanging="360"/>
+      </w:pPr>
+      <w:rPr>
+        <w:rFonts w:ascii="Symbol" w:hAnsi="Symbol" w:hint="default"/>
+        <w:sz w:val="20"/>
+      </w:rPr>
+    </w:lvl>
+    <w:lvl w:ilvl="1" w:tentative="1">
+      <w:start w:val="1"/>
+      <w:numFmt w:val="bullet"/>
+      <w:lvlText w:val="o"/>
+      <w:lvlJc w:val="left"/>
+      <w:pPr>
+        <w:tabs>
+          <w:tab w:val="num" w:pos="1440"/>
+        </w:tabs>
+        <w:ind w:left="1440" w:hanging="360"/>
+      </w:pPr>
+      <w:rPr>
+        <w:rFonts w:ascii="Courier New" w:hAnsi="Courier New" w:hint="default"/>
+        <w:sz w:val="20"/>
+      </w:rPr>
+    </w:lvl>
+    <w:lvl w:ilvl="2" w:tentative="1">
+      <w:start w:val="1"/>
+      <w:numFmt w:val="bullet"/>
+      <w:lvlText w:val=""/>
+      <w:lvlJc w:val="left"/>
+      <w:pPr>
+        <w:tabs>
+          <w:tab w:val="num" w:pos="2160"/>
+        </w:tabs>
+        <w:ind w:left="2160" w:hanging="360"/>
+      </w:pPr>
+      <w:rPr>
+        <w:rFonts w:ascii="Wingdings" w:hAnsi="Wingdings" w:hint="default"/>
+        <w:sz w:val="20"/>
+      </w:rPr>
+    </w:lvl>
+    <w:lvl w:ilvl="3" w:tentative="1">
+      <w:start w:val="1"/>
+      <w:numFmt w:val="bullet"/>
+      <w:lvlText w:val=""/>
+      <w:lvlJc w:val="left"/>
+      <w:pPr>
+        <w:tabs>
+          <w:tab w:val="num" w:pos="2880"/>
+        </w:tabs>
+        <w:ind w:left="2880" w:hanging="360"/>
+      </w:pPr>
+      <w:rPr>
+        <w:rFonts w:ascii="Wingdings" w:hAnsi="Wingdings" w:hint="default"/>
+        <w:sz w:val="20"/>
+      </w:rPr>
+    </w:lvl>
+    <w:lvl w:ilvl="4" w:tentative="1">
+      <w:start w:val="1"/>
+      <w:numFmt w:val="bullet"/>
+      <w:lvlText w:val=""/>
+      <w:lvlJc w:val="left"/>
+      <w:pPr>
+        <w:tabs>
+          <w:tab w:val="num" w:pos="3600"/>
+        </w:tabs>
+        <w:ind w:left="3600" w:hanging="360"/>
+      </w:pPr>
+      <w:rPr>
+        <w:rFonts w:ascii="Wingdings" w:hAnsi="Wingdings" w:hint="default"/>
+        <w:sz w:val="20"/>
+      </w:rPr>
+    </w:lvl>
+    <w:lvl w:ilvl="5" w:tentative="1">
+      <w:start w:val="1"/>
+      <w:numFmt w:val="bullet"/>
+      <w:lvlText w:val=""/>
+      <w:lvlJc w:val="left"/>
+      <w:pPr>
+        <w:tabs>
+          <w:tab w:val="num" w:pos="4320"/>
+        </w:tabs>
+        <w:ind w:left="4320" w:hanging="360"/>
+      </w:pPr>
+      <w:rPr>
+        <w:rFonts w:ascii="Wingdings" w:hAnsi="Wingdings" w:hint="default"/>
+        <w:sz w:val="20"/>
+      </w:rPr>
+    </w:lvl>
+    <w:lvl w:ilvl="6" w:tentative="1">
+      <w:start w:val="1"/>
+      <w:numFmt w:val="bullet"/>
+      <w:lvlText w:val=""/>
+      <w:lvlJc w:val="left"/>
+      <w:pPr>
+        <w:tabs>
+          <w:tab w:val="num" w:pos="5040"/>
+        </w:tabs>
+        <w:ind w:left="5040" w:hanging="360"/>
+      </w:pPr>
+      <w:rPr>
+        <w:rFonts w:ascii="Wingdings" w:hAnsi="Wingdings" w:hint="default"/>
+        <w:sz w:val="20"/>
+      </w:rPr>
+    </w:lvl>
+    <w:lvl w:ilvl="7" w:tentative="1">
+      <w:start w:val="1"/>
+      <w:numFmt w:val="bullet"/>
+      <w:lvlText w:val=""/>
+      <w:lvlJc w:val="left"/>
+      <w:pPr>
+        <w:tabs>
+          <w:tab w:val="num" w:pos="5760"/>
+        </w:tabs>
+        <w:ind w:left="5760" w:hanging="360"/>
+      </w:pPr>
+      <w:rPr>
+        <w:rFonts w:ascii="Wingdings" w:hAnsi="Wingdings" w:hint="default"/>
+        <w:sz w:val="20"/>
+      </w:rPr>
+    </w:lvl>
+    <w:lvl w:ilvl="8" w:tentative="1">
+      <w:start w:val="1"/>
+      <w:numFmt w:val="bullet"/>
+      <w:lvlText w:val=""/>
+      <w:lvlJc w:val="left"/>
+      <w:pPr>
+        <w:tabs>
+          <w:tab w:val="num" w:pos="6480"/>
+        </w:tabs>
+        <w:ind w:left="6480" w:hanging="360"/>
+      </w:pPr>
+      <w:rPr>
+        <w:rFonts w:ascii="Wingdings" w:hAnsi="Wingdings" w:hint="default"/>
+        <w:sz w:val="20"/>
+      </w:rPr>
+    </w:lvl>
+  </w:abstractNum>
+  <w:abstractNum w:abstractNumId="7" w15:restartNumberingAfterBreak="0">
     <w:nsid w:val="72697606"/>
     <w:multiLevelType w:val="multilevel"/>
     <w:tmpl w:val="2BFE0EB0"/>
@@ -3815,7 +5961,156 @@
       </w:rPr>
     </w:lvl>
   </w:abstractNum>
-  <w:abstractNum w:abstractNumId="5" w15:restartNumberingAfterBreak="0">
+  <w:abstractNum w:abstractNumId="8" w15:restartNumberingAfterBreak="0">
+    <w:nsid w:val="73F13758"/>
+    <w:multiLevelType w:val="multilevel"/>
+    <w:tmpl w:val="ECB230F0"/>
+    <w:lvl w:ilvl="0">
+      <w:start w:val="1"/>
+      <w:numFmt w:val="bullet"/>
+      <w:lvlText w:val=""/>
+      <w:lvlJc w:val="left"/>
+      <w:pPr>
+        <w:tabs>
+          <w:tab w:val="num" w:pos="720"/>
+        </w:tabs>
+        <w:ind w:left="720" w:hanging="360"/>
+      </w:pPr>
+      <w:rPr>
+        <w:rFonts w:ascii="Symbol" w:hAnsi="Symbol" w:hint="default"/>
+        <w:sz w:val="20"/>
+      </w:rPr>
+    </w:lvl>
+    <w:lvl w:ilvl="1" w:tentative="1">
+      <w:start w:val="1"/>
+      <w:numFmt w:val="bullet"/>
+      <w:lvlText w:val="o"/>
+      <w:lvlJc w:val="left"/>
+      <w:pPr>
+        <w:tabs>
+          <w:tab w:val="num" w:pos="1440"/>
+        </w:tabs>
+        <w:ind w:left="1440" w:hanging="360"/>
+      </w:pPr>
+      <w:rPr>
+        <w:rFonts w:ascii="Courier New" w:hAnsi="Courier New" w:hint="default"/>
+        <w:sz w:val="20"/>
+      </w:rPr>
+    </w:lvl>
+    <w:lvl w:ilvl="2" w:tentative="1">
+      <w:start w:val="1"/>
+      <w:numFmt w:val="bullet"/>
+      <w:lvlText w:val=""/>
+      <w:lvlJc w:val="left"/>
+      <w:pPr>
+        <w:tabs>
+          <w:tab w:val="num" w:pos="2160"/>
+        </w:tabs>
+        <w:ind w:left="2160" w:hanging="360"/>
+      </w:pPr>
+      <w:rPr>
+        <w:rFonts w:ascii="Wingdings" w:hAnsi="Wingdings" w:hint="default"/>
+        <w:sz w:val="20"/>
+      </w:rPr>
+    </w:lvl>
+    <w:lvl w:ilvl="3" w:tentative="1">
+      <w:start w:val="1"/>
+      <w:numFmt w:val="bullet"/>
+      <w:lvlText w:val=""/>
+      <w:lvlJc w:val="left"/>
+      <w:pPr>
+        <w:tabs>
+          <w:tab w:val="num" w:pos="2880"/>
+        </w:tabs>
+        <w:ind w:left="2880" w:hanging="360"/>
+      </w:pPr>
+      <w:rPr>
+        <w:rFonts w:ascii="Wingdings" w:hAnsi="Wingdings" w:hint="default"/>
+        <w:sz w:val="20"/>
+      </w:rPr>
+    </w:lvl>
+    <w:lvl w:ilvl="4" w:tentative="1">
+      <w:start w:val="1"/>
+      <w:numFmt w:val="bullet"/>
+      <w:lvlText w:val=""/>
+      <w:lvlJc w:val="left"/>
+      <w:pPr>
+        <w:tabs>
+          <w:tab w:val="num" w:pos="3600"/>
+        </w:tabs>
+        <w:ind w:left="3600" w:hanging="360"/>
+      </w:pPr>
+      <w:rPr>
+        <w:rFonts w:ascii="Wingdings" w:hAnsi="Wingdings" w:hint="default"/>
+        <w:sz w:val="20"/>
+      </w:rPr>
+    </w:lvl>
+    <w:lvl w:ilvl="5" w:tentative="1">
+      <w:start w:val="1"/>
+      <w:numFmt w:val="bullet"/>
+      <w:lvlText w:val=""/>
+      <w:lvlJc w:val="left"/>
+      <w:pPr>
+        <w:tabs>
+          <w:tab w:val="num" w:pos="4320"/>
+        </w:tabs>
+        <w:ind w:left="4320" w:hanging="360"/>
+      </w:pPr>
+      <w:rPr>
+        <w:rFonts w:ascii="Wingdings" w:hAnsi="Wingdings" w:hint="default"/>
+        <w:sz w:val="20"/>
+      </w:rPr>
+    </w:lvl>
+    <w:lvl w:ilvl="6" w:tentative="1">
+      <w:start w:val="1"/>
+      <w:numFmt w:val="bullet"/>
+      <w:lvlText w:val=""/>
+      <w:lvlJc w:val="left"/>
+      <w:pPr>
+        <w:tabs>
+          <w:tab w:val="num" w:pos="5040"/>
+        </w:tabs>
+        <w:ind w:left="5040" w:hanging="360"/>
+      </w:pPr>
+      <w:rPr>
+        <w:rFonts w:ascii="Wingdings" w:hAnsi="Wingdings" w:hint="default"/>
+        <w:sz w:val="20"/>
+      </w:rPr>
+    </w:lvl>
+    <w:lvl w:ilvl="7" w:tentative="1">
+      <w:start w:val="1"/>
+      <w:numFmt w:val="bullet"/>
+      <w:lvlText w:val=""/>
+      <w:lvlJc w:val="left"/>
+      <w:pPr>
+        <w:tabs>
+          <w:tab w:val="num" w:pos="5760"/>
+        </w:tabs>
+        <w:ind w:left="5760" w:hanging="360"/>
+      </w:pPr>
+      <w:rPr>
+        <w:rFonts w:ascii="Wingdings" w:hAnsi="Wingdings" w:hint="default"/>
+        <w:sz w:val="20"/>
+      </w:rPr>
+    </w:lvl>
+    <w:lvl w:ilvl="8" w:tentative="1">
+      <w:start w:val="1"/>
+      <w:numFmt w:val="bullet"/>
+      <w:lvlText w:val=""/>
+      <w:lvlJc w:val="left"/>
+      <w:pPr>
+        <w:tabs>
+          <w:tab w:val="num" w:pos="6480"/>
+        </w:tabs>
+        <w:ind w:left="6480" w:hanging="360"/>
+      </w:pPr>
+      <w:rPr>
+        <w:rFonts w:ascii="Wingdings" w:hAnsi="Wingdings" w:hint="default"/>
+        <w:sz w:val="20"/>
+      </w:rPr>
+    </w:lvl>
+  </w:abstractNum>
+  <w:abstractNum w:abstractNumId="9" w15:restartNumberingAfterBreak="0">
     <w:nsid w:val="7DCE1A33"/>
     <w:multiLevelType w:val="multilevel"/>
     <w:tmpl w:val="9328E3B6"/>
@@ -3965,22 +6260,34 @@
     </w:lvl>
   </w:abstractNum>
   <w:num w:numId="1" w16cid:durableId="945189946">
-    <w:abstractNumId w:val="2"/>
+    <w:abstractNumId w:val="3"/>
   </w:num>
   <w:num w:numId="2" w16cid:durableId="1249575864">
     <w:abstractNumId w:val="0"/>
   </w:num>
   <w:num w:numId="3" w16cid:durableId="842741173">
-    <w:abstractNumId w:val="5"/>
+    <w:abstractNumId w:val="9"/>
   </w:num>
   <w:num w:numId="4" w16cid:durableId="1751658830">
-    <w:abstractNumId w:val="4"/>
+    <w:abstractNumId w:val="7"/>
   </w:num>
   <w:num w:numId="5" w16cid:durableId="1045641995">
     <w:abstractNumId w:val="1"/>
   </w:num>
   <w:num w:numId="6" w16cid:durableId="1645769787">
-    <w:abstractNumId w:val="3"/>
+    <w:abstractNumId w:val="4"/>
+  </w:num>
+  <w:num w:numId="7" w16cid:durableId="1476557728">
+    <w:abstractNumId w:val="2"/>
+  </w:num>
+  <w:num w:numId="8" w16cid:durableId="1680156296">
+    <w:abstractNumId w:val="8"/>
+  </w:num>
+  <w:num w:numId="9" w16cid:durableId="1308323556">
+    <w:abstractNumId w:val="5"/>
+  </w:num>
+  <w:num w:numId="10" w16cid:durableId="1730491510">
+    <w:abstractNumId w:val="6"/>
   </w:num>
 </w:numbering>
 </file>

</xml_diff>